<commit_message>
Replace NSRE terminology with JSD in manuscript and docs
</commit_message>
<xml_diff>
--- a/docs/Supervised_distribution_divergence_guided_omics_imaging_manuscript_CN.docx
+++ b/docs/Supervised_distribution_divergence_guided_omics_imaging_manuscript_CN.docx
@@ -90,7 +90,7 @@
           <w:b w:val="0"/>
           <w:sz w:val="21"/>
         </w:rPr>
-        <w:t>方法：本研究以 TCGA-BRCA 的 mRNA、CNV 和 miRNA 为对象，提出一种监督式分布散度引导的组学空间表示框架（supervised information-divergence-guided omics spatial representation framework），即以 Jensen–Shannon divergence（JSD；实现中简称 NSRE）评估每个特征的判别重要性，并将其编码为可解释的空间表示。所有特征筛选、标准化和模型拟合均在 5 折交叉验证训练折内完成；按 JSD/NSRE 重要性降序并将高分特征置于中心，采用中心向外螺旋填充形成单通道灰度图，再输入全尺寸卷积神经网络（FullSizeCNN）。同时比较 LogisticRegression、RandomForest、GradientBoosting、SVC、KNN、MLP、CoxPH 及多种多组学融合策略。</w:t>
+        <w:t>方法：本研究以 TCGA-BRCA 的 mRNA、CNV 和 miRNA 为对象，提出一种监督式分布散度引导的组学空间表示框架（supervised information-divergence-guided omics spatial representation framework），即以 Jensen–Shannon divergence（JSD）评估每个特征的判别重要性，并将其编码为可解释的空间表示。所有特征筛选、标准化和模型拟合均在 5 折交叉验证训练折内完成；按 JSD 重要性降序并将高分特征置于中心，采用中心向外螺旋填充形成单通道灰度图，再输入全尺寸卷积神经网络（FullSizeCNN）。同时比较 LogisticRegression、RandomForest、GradientBoosting、SVC、KNN、MLP、CoxPH 及多种多组学融合策略。</w:t>
       </w:r>
     </w:p>
     <w:p>
@@ -301,7 +301,7 @@
           <w:b w:val="0"/>
           <w:sz w:val="22"/>
         </w:rPr>
-        <w:t>本研究针对上述问题，提出以 Jensen–Shannon divergence（JSD；实现中简称 NSRE）引导的组学图像化框架：先评估每个基因或探针对结局类别的区分能力，再按 JSD/NSRE 重要性降序并以中心向外螺旋方式填充图像，使高重要性特征集中于图像中心；随后以全尺寸卷积神经网络（FullSizeCNN）作为图像化基线，并与多种传统机器学习、MLP 和经典 CNN 结构进行对比。该方案既保留原始表达值，又将判别重要性显式编码到二维空间，便于后续关键因子定位。</w:t>
+        <w:t>本研究针对上述问题，提出以 Jensen–Shannon divergence（JSD）引导的组学图像化框架：先评估每个基因或探针对结局类别的区分能力，再按 JSD 重要性降序并以中心向外螺旋方式填充图像，使高重要性特征集中于图像中心；随后以全尺寸卷积神经网络（FullSizeCNN）作为图像化基线，并与多种传统机器学习、MLP 和经典 CNN 结构进行对比。该方案既保留原始表达值，又将判别重要性显式编码到二维空间，便于后续关键因子定位。</w:t>
       </w:r>
     </w:p>
     <w:p>
@@ -316,7 +316,7 @@
           <w:b w:val="0"/>
           <w:sz w:val="22"/>
         </w:rPr>
-        <w:t>本文提出三个假设：（1）NSRE 排序比随机排序或平均表达排序更适合 PAM50 四分类和生存预测；（2）在小样本组学图像上，FullSizeCNN 能够提供与传统机器学习基线可比或互补的预测性能；（3）在统一交集样本上，多组学融合可较最优单组学带来生存预测上的稳健增益，但在 PAM50 中增益有限。</w:t>
+        <w:t>本文提出三个假设：（1）JSD 排序比随机排序或平均表达排序更适合 PAM50 四分类和生存预测；（2）在小样本组学图像上，FullSizeCNN 能够提供与传统机器学习基线可比或互补的预测性能；（3）在统一交集样本上，多组学融合可较最优单组学带来生存预测上的稳健增益，但在 PAM50 中增益有限。</w:t>
       </w:r>
     </w:p>
     <w:p>
@@ -331,7 +331,7 @@
           <w:b w:val="0"/>
           <w:sz w:val="22"/>
         </w:rPr>
-        <w:t>本文的贡献包括：提出 NSRE 引导的中心-螺旋组学图像化框架；系统比较传统机器学习、MLP、FullSizeCNN 及多种多组学融合策略；在严格 5 折交叉验证下报告均值和标准差；利用 SHAP、CNN saliency 和基因功能类别图开展关键因子可视化；并通过方案2功能类别遮盖实验与等量随机遮盖对照，评估不同功能模块对 PAM50 分类和生存预测的贡献。</w:t>
+        <w:t>本文的贡献包括：提出 JSD 引导的中心-螺旋组学图像化框架；系统比较传统机器学习、MLP、FullSizeCNN 及多种多组学融合策略；在严格 5 折交叉验证下报告均值和标准差；利用 SHAP、CNN saliency 和基因功能类别图开展关键因子可视化；并通过方案2功能类别遮盖实验与等量随机遮盖对照，评估不同功能模块对 PAM50 分类和生存预测的贡献。</w:t>
       </w:r>
     </w:p>
     <w:p>
@@ -1094,7 +1094,7 @@
           <w:color w:val="2E74B5"/>
           <w:sz w:val="26"/>
         </w:rPr>
-        <w:t>2.3 特征筛选与 JSD/NSRE</w:t>
+        <w:t>2.3 特征筛选与 JSD</w:t>
       </w:r>
     </w:p>
     <w:p>
@@ -1109,7 +1109,7 @@
           <w:b w:val="0"/>
           <w:sz w:val="22"/>
         </w:rPr>
-        <w:t>为避免测试集信息泄漏，所有特征筛选均在每个交叉验证训练折内部完成。基础特征筛选方法包括低方差过滤、F 值（ANOVA）、L1/LASSO 和 Jensen–Shannon divergence（JSD；实现中简称 NSRE）[44]。JSD 通过比较不同类别中特征值的分箱直方图，计算两个离散分布之间的对称信息散度。</w:t>
+        <w:t>为避免测试集信息泄漏，所有特征筛选均在每个交叉验证训练折内部完成。基础特征筛选方法包括低方差过滤、F 值（ANOVA）、L1/LASSO 和 Jensen–Shannon divergence（JSD）[44]。JSD 通过比较不同类别中特征值的分箱直方图，计算两个离散分布之间的对称信息散度。</w:t>
       </w:r>
     </w:p>
     <w:p>
@@ -1236,7 +1236,7 @@
           <w:b w:val="0"/>
           <w:sz w:val="22"/>
         </w:rPr>
-        <w:t>对每个任务和组学，先计算每个特征的 JSD/NSRE 分数并按降序排序。采用中心向外的螺旋顺序，将最高重要性特征放在图像中心，次高重要性特征沿螺旋向外排列。若特征数小于网格容量，剩余位置补零。图像为单通道灰度图，像素值即对应组学特征值；模型训练时仅在训练折内估计标准化参数并应用于训练折与测试折。最终图像尺寸为：PAM50 mRNA 20×20、CNV 8×8、miRNA 25×25；生存 mRNA 15×15、CNV 13×13、miRNA 25×25。</w:t>
+        <w:t>对每个任务和组学，先计算每个特征的 JSD 分数并按降序排序。采用中心向外的螺旋顺序，将最高重要性特征放在图像中心，次高重要性特征沿螺旋向外排列。若特征数小于网格容量，剩余位置补零。图像为单通道灰度图，像素值即对应组学特征值；模型训练时仅在训练折内估计标准化参数并应用于训练折与测试折。最终图像尺寸为：PAM50 mRNA 20×20、CNV 8×8、miRNA 25×25；生存 mRNA 15×15、CNV 13×13、miRNA 25×25。</w:t>
       </w:r>
     </w:p>
     <w:p>
@@ -1251,7 +1251,7 @@
           <w:b w:val="0"/>
           <w:sz w:val="22"/>
         </w:rPr>
-        <w:t>为增强像素邻接的生物学可解释性，进一步采用方案2：先按功能大类将特征分块，再在块内按 JSD/NSRE 降序，并按块平均 JSD/NSRE 由中心向外螺旋填充。mRNA 和 CNV 的功能类别基于基因功能注释，miRNA 先由 MIMAT 映射至 hsa-miR 名称，再按 miRNA 家族/已知功能归类。对应生成功能类别图；在遮盖实验中，将目标功能类别的像素区域置零后重新训练 FullSizeCNN，并与不遮盖基线及同数量随机基因遮盖对照比较。</w:t>
+        <w:t>为增强像素邻接的生物学可解释性，进一步采用方案2：先按功能大类将特征分块，再在块内按 JSD 降序，并按块平均 JSD 由中心向外螺旋填充。mRNA 和 CNV 的功能类别基于基因功能注释，miRNA 先由 MIMAT 映射至 hsa-miR 名称，再按 miRNA 家族/已知功能归类。对应生成功能类别图；在遮盖实验中，将目标功能类别的像素区域置零后重新训练 FullSizeCNN，并与不遮盖基线及同数量随机基因遮盖对照比较。</w:t>
       </w:r>
     </w:p>
     <w:p>
@@ -1266,7 +1266,7 @@
           <w:color w:val="1F4D78"/>
           <w:sz w:val="19"/>
         </w:rPr>
-        <w:t>Table 2. Final feature counts and NSRE image sizes</w:t>
+        <w:t>Table 2. Final feature counts and JSD image sizes</w:t>
       </w:r>
     </w:p>
     <w:tbl>
@@ -2628,7 +2628,7 @@
           <w:color w:val="555555"/>
           <w:sz w:val="18"/>
         </w:rPr>
-        <w:t>Figure 2. FullSizeCNN architecture. An H×W×1 NSRE image is transformed by a full-size convolutional layer with H×W kernels and 32 filters, flattened to 32 features, and passed through a 64-unit ReLU/Dropout MLP head. PAM50 uses H=W=20 and four output units; survival uses H=W=15 and one risk output.</w:t>
+        <w:t>Figure 2. FullSizeCNN architecture. An H×W×1 JSD image is transformed by a full-size convolutional layer with H×W kernels and 32 filters, flattened to 32 features, and passed through a 64-unit ReLU/Dropout MLP head. PAM50 uses H=W=20 and four output units; survival uses H=W=15 and one risk output.</w:t>
       </w:r>
     </w:p>
     <w:p>
@@ -2828,7 +2828,7 @@
           <w:b w:val="0"/>
           <w:sz w:val="22"/>
         </w:rPr>
-        <w:t>图 3 展示一个 PAM50 mRNA 样本和一个 Survival mRNA 样本的灰度表达图、NSRE 权重图和基因功能类别图。图像中心区域对应高 NSRE 特征，说明视觉上的中心区域直接编码了模型认为对结局判别更重要的基因。基因功能类别图以颜色标记基因功能类别，与 NSRE 灰度图位置严格对应，便于后续把卷积模型关注区域转化为生物学解释。</w:t>
+        <w:t>图 3 展示一个 PAM50 mRNA 样本和一个 Survival mRNA 样本的灰度表达图、JSD 权重图和基因功能类别图。图像中心区域对应高 JSD 特征，说明视觉上的中心区域直接编码了模型认为对结局判别更重要的基因。基因功能类别图以颜色标记基因功能类别，与 JSD 灰度图位置严格对应，便于后续把卷积模型关注区域转化为生物学解释。</w:t>
       </w:r>
     </w:p>
     <w:p>
@@ -2883,7 +2883,7 @@
           <w:color w:val="555555"/>
           <w:sz w:val="18"/>
         </w:rPr>
-        <w:t>Figure 3. Omics image examples. A1-A3: one PAM50 mRNA sample shown as a 20×20 grayscale expression map, NSRE importance map, and gene functional category map. B1-B3: one survival mRNA sample shown as a 15×15 grayscale expression map, NSRE importance map, and gene functional category map. Axes indicate pixel positions; high-NSRE features are placed centrally, and the functional category map aligns pixel-wise with the expression and NSRE maps.</w:t>
+        <w:t>Figure 3. Omics image examples. A1-A3: one PAM50 mRNA sample shown as a 20×20 grayscale expression map, JSD importance map, and gene functional category map. B1-B3: one survival mRNA sample shown as a 15×15 grayscale expression map, JSD importance map, and gene functional category map. Axes indicate pixel positions; high-JSD features are placed centrally, and the functional category map aligns pixel-wise with the expression and JSD maps.</w:t>
       </w:r>
     </w:p>
     <w:p>
@@ -4263,7 +4263,7 @@
           <w:color w:val="555555"/>
           <w:sz w:val="18"/>
         </w:rPr>
-        <w:t>Figure 7. NSRE-based feature-mining visualization. A-C: grayscale expression, NSRE importance, and functional category maps; D-F: SHAP importance, CNN saliency, and functional-category/saliency overlay maps. Axes indicate pixel positions; the NSRE imaging scheme aligns expression, importance, function, and model attention in a common pixel coordinate system.</w:t>
+        <w:t>Figure 7. JSD-based feature-mining visualization. A-C: grayscale expression, JSD importance, and functional category maps; D-F: SHAP importance, CNN saliency, and functional-category/saliency overlay maps. Axes indicate pixel positions; the JSD imaging scheme aligns expression, importance, function, and model attention in a common pixel coordinate system.</w:t>
       </w:r>
     </w:p>
     <w:p>
@@ -4294,7 +4294,7 @@
           <w:b w:val="0"/>
           <w:sz w:val="22"/>
         </w:rPr>
-        <w:t>为进一步解释组学图像中不同功能区域对模型的贡献，本研究在方案2（功能大类分块 + 中心高重要性 + 中心向外螺旋填充）图像上实施功能类别遮盖实验。与最初的 NSRE 全局排序图像不同，方案2先按基因功能类别分块，再在块内按 NSRE 降序，并以块平均重要性由中心向外螺旋填充，因此同一颜色区域对应同一功能模块，中心区域对应高 NSRE 模块。该设计使图像像素邻接具有更明确的生物学含义，并支持对连续功能区域进行模块级遮挡。</w:t>
+        <w:t>为进一步解释组学图像中不同功能区域对模型的贡献，本研究在方案2（功能大类分块 + 中心高重要性 + 中心向外螺旋填充）图像上实施功能类别遮盖实验。与最初的 JSD 全局排序图像不同，方案2先按基因功能类别分块，再在块内按 JSD 降序，并以块平均重要性由中心向外螺旋填充，因此同一颜色区域对应同一功能模块，中心区域对应高 JSD 模块。该设计使图像像素邻接具有更明确的生物学含义，并支持对连续功能区域进行模块级遮挡。</w:t>
       </w:r>
     </w:p>
     <w:p>
@@ -4480,7 +4480,7 @@
           <w:b w:val="0"/>
           <w:sz w:val="22"/>
         </w:rPr>
-        <w:t>为区分“PAM50 分型预测”与“PAM50 基因面板重建”，本研究在 mRNA PAM50 任务上进行了 50 基因剔除敏感性分析：将最终 400 个 NSRE 排序特征中与经典 PAM50 50 基因重叠的 21 个基因剔除后，LogisticRegression 的 5 折 Accuracy 保持不变（0.9628±0.0138），MLP 与 FullSizeCNN 仅有轻微波动；而仅保留这 21 个 PAM50 基因时，LogisticRegression Accuracy 降至 0.9220±0.0076。该结果表明，NSRE 筛选出的 mRNA 特征集所携带的判别信息并非主要来自经典 PAM50 基因面板，而是覆盖了更广的转录组信号，因此本研究的 mRNA PAM50 任务应理解为对既有分子亚型的重建（subtype reconstruction），而非对 PAM50 50 基因面板的简单复现，也不宜被解释为独立的临床预后预测器。</w:t>
+        <w:t>为区分“PAM50 分型预测”与“PAM50 基因面板重建”，本研究在 mRNA PAM50 任务上进行了 50 基因剔除敏感性分析：将最终 400 个 JSD 排序特征中与经典 PAM50 50 基因重叠的 21 个基因剔除后，LogisticRegression 的 5 折 Accuracy 保持不变（0.9628±0.0138），MLP 与 FullSizeCNN 仅有轻微波动；而仅保留这 21 个 PAM50 基因时，LogisticRegression Accuracy 降至 0.9220±0.0076。该结果表明，JSD 筛选出的 mRNA 特征集所携带的判别信息并非主要来自经典 PAM50 基因面板，而是覆盖了更广的转录组信号，因此本研究的 mRNA PAM50 任务应理解为对既有分子亚型的重建（subtype reconstruction），而非对 PAM50 50 基因面板的简单复现，也不宜被解释为独立的临床预后预测器。</w:t>
       </w:r>
     </w:p>
     <w:p>
@@ -4510,7 +4510,7 @@
           <w:b w:val="0"/>
           <w:sz w:val="22"/>
         </w:rPr>
-        <w:t>NSRE 图像化的优势在于提供可解释性，而不是仅仅追求最高预测精度。传统 CNN 将基因排列成任意二维结构，像素邻接关系可能缺乏生物学意义；本研究通过把 NSRE 高分基因放在中心，并同时绘制基因功能类别图和模型 saliency 图，使卷积关注区域可以直观映射到关键基因和通路。</w:t>
+        <w:t>JSD 图像化的优势在于提供可解释性，而不是仅仅追求最高预测精度。传统 CNN 将基因排列成任意二维结构，像素邻接关系可能缺乏生物学意义；本研究通过把 JSD 高分基因放在中心，并同时绘制基因功能类别图和模型 saliency 图，使卷积关注区域可以直观映射到关键基因和通路。</w:t>
       </w:r>
     </w:p>
     <w:p>
@@ -4540,7 +4540,7 @@
           <w:b w:val="0"/>
           <w:sz w:val="22"/>
         </w:rPr>
-        <w:t>作为对排序假设的直接检验，本研究在 mRNA 上对 NSRE/JSD 螺旋排序与 20 次随机基因排列进行了对照。结果表明，NSRE 螺旋排序并未优于随机排列：PAM50 Accuracy 的 NSRE 结果为 0.9316，而 20 次随机排列的均值为 0.9267（范围 0.9112–0.9400，经验 p=0.25）；Survival C-index 的 NSRE 结果为 0.7125，随机排列均值为 0.7055（经验 p=0.35）。均值表达排序在 PAM50 Accuracy 上与 NSRE 完全一致（0.9316），进一步说明二维像素位置本身几乎不携带预测信息。据此，本文将组学图像化明确限定为一种“可解释的空间表示”，而不是能提升分类或生存预测精度的排序方法。</w:t>
+        <w:t>作为对排序假设的直接检验，本研究在 mRNA 上对 JSD 螺旋排序与 20 次随机基因排列进行了对照。结果表明，JSD 螺旋排序并未优于随机排列：PAM50 Accuracy 的 JSD 结果为 0.9316，而 20 次随机排列的均值为 0.9267（范围 0.9112–0.9400，经验 p=0.25）；Survival C-index 的 JSD 结果为 0.7125，随机排列均值为 0.7055（经验 p=0.35）。均值表达排序在 PAM50 Accuracy 上与 JSD 完全一致（0.9316），进一步说明二维像素位置本身几乎不携带预测信息。据此，本文将组学图像化明确限定为一种“可解释的空间表示”，而不是能提升分类或生存预测精度的排序方法。</w:t>
       </w:r>
     </w:p>
     <w:p>
@@ -4570,7 +4570,7 @@
           <w:b w:val="0"/>
           <w:sz w:val="22"/>
         </w:rPr>
-        <w:t>与已有“表格数据→图像”的表示方法相比，DeepInsight 通过 t-SNE 把特征点布局为二维图像以利用 CNN 的局部感受野，DeepInsight-3D 进一步将其推广到多组学三维表示，Yan 等则基于转录组特征图进行癌型与生存预测[32-34]；SurvConvMixer 利用通路级基因表达图像进行癌症生存预测[50]，MoACNN-XGNet 则构建面向乳腺癌亚型的可解释多组学卷积网络[51]。本研究与这些工作的关键区别在于：其一，本研究使用监督式 JSD/NSRE 而非无监督降维来指导空间布局，并把基因功能类别与模型注意力对齐到同一像素坐标系，从而将空间位置直接绑定到可解释的生物学注释；其二，本文的 Dense 等价与随机排列对照表明，在本数据规模下二维空间布局本身并不带来预测增益，因此图像化被定位为可解释表示而非性能提升手段。这一结论与 DeepInsight 系列“图像化有助于 CNN 建模”的动机形成互补而非冲突——在更大样本或真实空间先验（如通路网络）可用时，空间结构才更可能产生增益。</w:t>
+        <w:t>与已有“表格数据→图像”的表示方法相比，DeepInsight 通过 t-SNE 把特征点布局为二维图像以利用 CNN 的局部感受野，DeepInsight-3D 进一步将其推广到多组学三维表示，Yan 等则基于转录组特征图进行癌型与生存预测[32-34]；SurvConvMixer 利用通路级基因表达图像进行癌症生存预测[50]，MoACNN-XGNet 则构建面向乳腺癌亚型的可解释多组学卷积网络[51]。本研究与这些工作的关键区别在于：其一，本研究使用监督式 JSD 而非无监督降维来指导空间布局，并把基因功能类别与模型注意力对齐到同一像素坐标系，从而将空间位置直接绑定到可解释的生物学注释；其二，本文的 Dense 等价与随机排列对照表明，在本数据规模下二维空间布局本身并不带来预测增益，因此图像化被定位为可解释表示而非性能提升手段。这一结论与 DeepInsight 系列“图像化有助于 CNN 建模”的动机形成互补而非冲突——在更大样本或真实空间先验（如通路网络）可用时，空间结构才更可能产生增益。</w:t>
       </w:r>
     </w:p>
     <w:p>
@@ -4615,7 +4615,7 @@
           <w:b w:val="0"/>
           <w:sz w:val="22"/>
         </w:rPr>
-        <w:t>与已有研究相比，本工作的贡献不在于简单追求最高分类准确率，而在于提供一种可追溯、可映射到关键基因的组学图像化表示。该表示既保留原始特征值，又通过 NSRE 将判别重要性显式编码到图像空间，为后续关键因子挖掘和临床转化提供了统一接口。</w:t>
+        <w:t>与已有研究相比，本工作的贡献不在于简单追求最高分类准确率，而在于提供一种可追溯、可映射到关键基因的组学图像化表示。该表示既保留原始特征值，又通过 JSD 将判别重要性显式编码到图像空间，为后续关键因子挖掘和临床转化提供了统一接口。</w:t>
       </w:r>
     </w:p>
     <w:p>
@@ -4646,7 +4646,7 @@
           <w:b w:val="0"/>
           <w:sz w:val="22"/>
         </w:rPr>
-        <w:t>本研究建立了 JSD/NSRE 引导的组学图像化与多组学融合框架，能够同时支持乳腺癌 PAM50 四分类和总生存预测。mRNA 单组学在分子分型重建（subtype reconstruction）中表现最优，且其判别信息并非主要依赖经典 PAM50 基因面板；生存预测更依赖多组学互补。FullSizeCNN 为组学图像化提供了轻量、可解释的基线。未来可在外部数据和更稳健融合策略下进一步验证。</w:t>
+        <w:t>本研究建立了 JSD 引导的组学图像化与多组学融合框架，能够同时支持乳腺癌 PAM50 四分类和总生存预测。mRNA 单组学在分子分型重建（subtype reconstruction）中表现最优，且其判别信息并非主要依赖经典 PAM50 基因面板；生存预测更依赖多组学互补。FullSizeCNN 为组学图像化提供了轻量、可解释的基线。未来可在外部数据和更稳健融合策略下进一步验证。</w:t>
       </w:r>
     </w:p>
     <w:p>
@@ -5406,7 +5406,7 @@
           <w:b w:val="0"/>
           <w:sz w:val="22"/>
         </w:rPr>
-        <w:t>本研究的处理数据、特征选择与建模代码、NSRE/JSD 图像、结果表、补充材料及可复现说明已整理为代码与数据仓库并公开托管于 GitHub（repository: NSRE_omics_imaging_breast_cancer），仓库链接见正文末尾的 Code availability 条目。</w:t>
+        <w:t>本研究的处理数据、特征选择与建模代码、JSD 图像、结果表、补充材料及可复现说明已整理为代码与数据仓库并公开托管于 GitHub（repository: Supervised_distribution_divergence_omics_imaging_breast_cancer），仓库链接见正文末尾的 Code availability 条目。</w:t>
       </w:r>
     </w:p>
     <w:p>
@@ -5421,7 +5421,7 @@
           <w:b w:val="0"/>
           <w:sz w:val="22"/>
         </w:rPr>
-        <w:t>Code availability：https://github.com/381521602/NSRE_omics_imaging_breast_cancer</w:t>
+        <w:t>Code availability：https://github.com/381521602/Supervised_distribution_divergence_omics_imaging_breast_cancer</w:t>
       </w:r>
     </w:p>
     <w:p>

</xml_diff>

<commit_message>
Align claims and add stress pathway gene sets and FDR
</commit_message>
<xml_diff>
--- a/docs/Supervised_distribution_divergence_guided_omics_imaging_manuscript_CN.docx
+++ b/docs/Supervised_distribution_divergence_guided_omics_imaging_manuscript_CN.docx
@@ -14,7 +14,7 @@
           <w:color w:val="0B2545"/>
           <w:sz w:val="30"/>
         </w:rPr>
-        <w:t>Supervised distribution-divergence-guided omics imaging and multi-omics fusion for breast cancer molecular subtyping and survival prediction</w:t>
+        <w:t>Interpretable distribution-divergence-guided omics imaging and multi-omics integration for breast cancer molecular subtype reconstruction and survival risk modeling</w:t>
       </w:r>
     </w:p>
     <w:p>
@@ -29,7 +29,7 @@
           <w:color w:val="1F4D78"/>
           <w:sz w:val="24"/>
         </w:rPr>
-        <w:t>监督式分布散度引导的组学图像化与多组学融合用于乳腺癌分子分型及生存预测</w:t>
+        <w:t>可解释的监督式分布散度引导组学图像化与多组学整合用于乳腺癌分子亚型重建和生存风险建模</w:t>
       </w:r>
     </w:p>
     <w:p>
@@ -105,7 +105,7 @@
           <w:b w:val="0"/>
           <w:sz w:val="21"/>
         </w:rPr>
-        <w:t>结果：在单组学 PAM50 四分类中，mRNA LogisticRegression 的 Accuracy 为 0.9628±0.0167、Macro-F1 为 0.9575±0.0199；CNV 最优 MLP 为 0.7213±0.0156；miRNA 最优 LogisticRegression 为 0.8410±0.0120。生存预测中，mRNA FullSizeCNN 的 C-index 为 0.7125±0.0303，CNV CoxPH 为 0.7109±0.0339，miRNA FullSizeCNN 为 0.6067±0.0703。多组学整合中，PAM50 的 Transformer 达到 Accuracy 0.9270±0.0132、Macro-F1 0.9288±0.0128；生存预测的三组学 Concat MLP 达到 C-index 0.7588±0.0492，CNN 晚期平均融合达到 ROC AUC 0.7591±0.0619。配对检验显示，上述最优融合均未较对应最优单组学形成统计显著优势（所有配对检验 p≥0.093）。可解释分析识别出 ESR1、TFF1、AGR3、FOXC1、MIA、FABP7、CCL19、MS4A1 等关键因子，富集于雌激素信号、细胞增殖调控、细胞分裂和上皮发育等通路。方案2功能类别遮盖分析在控制特征集合大小后，未能建立稳健的类别特异效应（masking analyses did not establish robust category-specific effects after controlling for feature-set size）。</w:t>
+        <w:t>结果：在单组学 PAM50 四分类中，mRNA LogisticRegression 的 Accuracy 为 0.9628±0.0167、Macro-F1 为 0.9575±0.0199；CNV 最优 MLP 为 0.7213±0.0156；miRNA 最优 LogisticRegression 为 0.8410±0.0120。生存风险建模中，mRNA FullSizeCNN 的 C-index 为 0.7125±0.0303，CNV CoxPH 为 0.7109±0.0339，miRNA FullSizeCNN 为 0.6067±0.0703。多组学整合中，PAM50 的 Transformer 达到 Accuracy 0.9270±0.0132、Macro-F1 0.9288±0.0128；生存风险建模的三组学 Concat MLP 达到 C-index 0.7588±0.0492，CNN 晚期平均融合达到 ROC AUC 0.7591±0.0619。配对检验显示，上述最优融合均未较对应最优单组学形成统计显著优势（所有配对检验 p≥0.093）。Dense-equivalent controls performed comparably to or better than FullSizeCNN, while JSD-guided spiral ordering did not significantly outperform random permutations, indicating that the principal value of imaging was interpretability rather than predictive gain。可解释分析识别出 ESR1、TFF1、AGR3、FOXC1、MIA、FABP7、CCL19、MS4A1 等关键因子，富集于雌激素信号、细胞增殖调控、细胞分裂和上皮发育等通路。方案2功能类别遮盖分析在控制特征集合大小后，未能建立稳健的类别特异效应。</w:t>
       </w:r>
     </w:p>
     <w:p>
@@ -120,7 +120,7 @@
           <w:b w:val="0"/>
           <w:sz w:val="21"/>
         </w:rPr>
-        <w:t>结论：监督式分布散度引导的组学空间表示框架能够将高维组学特征转换为适合全尺寸卷积建模的图像表示，并支持关键因子可视化；该表示的价值在于可解释性而非预测精度提升。mRNA 是 PAM50 分型重建的主要信号，生存预测更依赖多组学互补；当前整合策略的增益有限，尚需外部验证和更稳健的融合设计。</w:t>
+        <w:t>结论：监督式分布散度引导的组学空间表示框架能够把高维组学特征转换为适合全尺寸卷积建模的可解释图像坐标，并支持关键因子可视化。mRNA 是 PAM50 亚型重建的主要信号；生存风险建模显示多组学融合具有数值提升但未达到统计显著，提示存在需要独立验证的潜在互补信息。该表示的主要价值是可解释性而非由人工二维邻接带来的预测精度提升。</w:t>
       </w:r>
     </w:p>
     <w:p>
@@ -316,7 +316,7 @@
           <w:b w:val="0"/>
           <w:sz w:val="22"/>
         </w:rPr>
-        <w:t>本文提出三个假设：（1）JSD 排序比随机排序或平均表达排序更适合 PAM50 四分类和生存预测；（2）在小样本组学图像上，FullSizeCNN 能够提供与传统机器学习基线可比或互补的预测性能；（3）在统一交集样本上，多组学融合可较最优单组学带来生存预测上的稳健增益，但在 PAM50 中增益有限。</w:t>
+        <w:t>本文提出三个研究问题：（1）检验 JSD 引导的空间排序是否相较随机或表达量排序产生可检测的预测增益，并评估其主要价值是否体现于可解释性而非性能提升；（2）检验 FullSizeCNN 在小样本组学任务中能否达到传统机器学习的竞争性性能，并通过 Dense 等价基线区分图像空间结构与原始特征值本身的贡献；（3）检验统一样本集上的多组学融合是否提供相对于最优单组学的可重复增益。</w:t>
       </w:r>
     </w:p>
     <w:p>
@@ -2573,7 +2573,7 @@
           <w:b w:val="0"/>
           <w:sz w:val="22"/>
         </w:rPr>
-        <w:t>FullSizeCNN 的输入为 H×W×1 图像，第一层使用与 H×W 相同的全尺寸卷积核，输出 32 个 1×1 特征图；随后展平为 32 维向量，经 64 维全连接、ReLU 和 Dropout 后输出分类 logits 或生存风险。该结构参数较少，与图像尺寸解耦，适合当前小样本高维组学图像。</w:t>
+        <w:t>FullSizeCNN 的输入为 H×W×1 图像，第一层使用与 H×W 相同的全尺寸卷积核，输出 32 个 1×1 特征图；随后展平为 32 维向量，经 64 维全连接、ReLU 和 Dropout 后输出分类 logits 或生存风险。需要指出，该全尺寸卷积核在数学上等价于展平后的全连接投影，因此本文将其视为保留图像坐标接口的 full-field convolutional network，而不是滑动/局部卷积特征提取器；其图像接口主要用于后续归因可视化，而非依赖二维局部感受野获得预测增益。</w:t>
       </w:r>
     </w:p>
     <w:p>
@@ -2766,7 +2766,7 @@
           <w:color w:val="555555"/>
           <w:sz w:val="18"/>
         </w:rPr>
-        <w:t>说明：所有表格与图中结果均为“基于训练折内筛选特征的结果”，在 5 折交叉验证下给出均值±标准差。PAM50 四分类报告 Accuracy 和 Macro-F1；生存预测报告 ROC AUC 和 Cox C-index。ROC AUC 以模型输出的死亡风险概率/风险分数作为连续预测分数计算；C-index 使用同一风险分数、生存时间与事件状态，通过 lifelines.utils.concordance_index 计算。</w:t>
+        <w:t>说明：所有表格与图中结果均为“基于训练折内筛选特征的结果”，在 5 折交叉验证下给出均值±标准差。PAM50 四分类报告 Accuracy 和 Macro-F1；生存预测报告 ROC AUC 和 Cox C-index。ROC AUC 以模型输出的死亡风险概率/风险分数作为连续预测分数计算；C-index 使用取负后的风险分数、生存时间与事件状态，通过 lifelines.utils.concordance_index 计算，风险分数越大代表死亡风险越高。</w:t>
       </w:r>
     </w:p>
     <w:p>
@@ -2828,7 +2828,7 @@
           <w:b w:val="0"/>
           <w:sz w:val="22"/>
         </w:rPr>
-        <w:t>图 3 展示一个 PAM50 mRNA 样本和一个 Survival mRNA 样本的灰度表达图、JSD 权重图和基因功能类别图。图像中心区域对应高 JSD 特征，说明视觉上的中心区域直接编码了模型认为对结局判别更重要的基因。基因功能类别图以颜色标记基因功能类别，与 JSD 灰度图位置严格对应，便于后续把卷积模型关注区域转化为生物学解释。</w:t>
+        <w:t>图 3 展示一个 PAM50 mRNA 样本和一个 Survival mRNA 样本的灰度表达图、JSD 权重图和基因功能类别图。图像中心区域对应高 JSD 特征，说明视觉中心区域编码了基于训练数据类别分布差异获得的 JSD 判别重要性；只有 SHAP/saliency 才表示模型归因重要性。基因功能类别图以颜色标记基因功能类别，与 JSD 灰度图位置严格对应，便于后续把卷积模型关注区域转化为生物学解释。</w:t>
       </w:r>
     </w:p>
     <w:p>
@@ -4208,7 +4208,7 @@
           <w:b w:val="0"/>
           <w:sz w:val="22"/>
         </w:rPr>
-        <w:t>SHAP 分析显示，mRNA PAM50 LogisticRegression 的关键基因包括 CYP2B7P1、TFF1、C1orf64、AGR3、KCNJ3、MIA、PPP1R14C、ESR1 和 STAC2。CNN saliency 与 SHAP 的共识基因包括 TCAM1P、MIA、SMC1B、PPP1R14C、KLK6、SLC6A11、FABP7 和 FOXC1。生存单变量 Cox 分析识别出 MS4A1、COL17A1、C2orf40、PLA2G2D、FABP7、CCL19 和 GZMB。通路富集提示雌激素信号、细胞增殖调控、细胞分裂和上皮发育等生物学过程；SHAP 与 saliency 单图见补充材料图 S3–S7。</w:t>
+        <w:t>SHAP 分析显示，mRNA PAM50 LogisticRegression 的关键基因包括 CYP2B7P1、TFF1、C1orf64、AGR3、KCNJ3、MIA、PPP1R14C、ESR1 和 STAC2。CNN saliency 与 SHAP 的共识基因包括 TCAM1P、MIA、SMC1B、PPP1R14C、KLK6、SLC6A11、FABP7 和 FOXC1。生存单变量 Cox 分析识别出 MS4A1、COL17A1、C2orf40、PLA2G2D、FABP7、CCL19 和 GZMB。通路富集提示雌激素信号、细胞增殖调控、细胞分裂和上皮发育等生物学过程；SHAP、saliency、consensus、survival Cox 与 pathway enrichment 图分别见补充材料图 S5–S9。</w:t>
       </w:r>
     </w:p>
     <w:p>
@@ -4364,7 +4364,7 @@
           <w:b w:val="0"/>
           <w:sz w:val="22"/>
         </w:rPr>
-        <w:t>对 mRNA、CNV 和 miRNA 分别遮盖 Development/Epithelium、Signaling/Transport、Hormone/Metabolism、Cell cycle/Proliferation 和 Other 等类别。mRNA PAM50 基线 Accuracy 为 0.9244±0.0124，Macro-F1 为 0.9069±0.0133；遮盖 Other 后 Macro-F1 降至 0.8819±0.0210。mRNA 生存基线 C-index 为 0.6984±0.0756，遮盖 Other 后降至 0.6757±0.0715。CNV 和 miRNA 同样显示 Other 类遮盖后性能下降最明显，但由于 Other 类特征数量较多，下降幅度同时受模块大小影响；mRNA 结果见补充材料表 S14，CNV/miRNA 结果见补充材料表 S15。</w:t>
+        <w:t>对 mRNA、CNV 和 miRNA 分别遮盖 Development/Epithelium、Signaling/Transport、Hormone/Metabolism、Cell cycle/Proliferation 和 Other 等类别。mRNA PAM50 基线 Accuracy 为 0.9244±0.0124，Macro-F1 为 0.9069±0.0133；遮盖 Other 后 Macro-F1 降至 0.8819±0.0210。mRNA 生存基线 C-index 为 0.6984±0.0756，遮盖 Other 后降至 0.6757±0.0715。CNV 和 miRNA 同样显示 Other 类遮盖后性能下降最明显，但由于 Other 类特征数量较多，下降幅度同时受模块大小影响；mRNA 结果见补充材料表 S16，CNV/miRNA 结果见补充材料表 S17。</w:t>
       </w:r>
     </w:p>
     <w:p>
@@ -4434,7 +4434,7 @@
           <w:b w:val="0"/>
           <w:sz w:val="22"/>
         </w:rPr>
-        <w:t>为区分“功能模块特异性贡献”与“特征数量/区域大小效应”，对 mRNA 每个类别设置同数量随机基因遮盖对照。结果显示，功能类别遮盖与等量随机遮盖的性能差异在多数比较中未达到显著水平。对 mRNA PAM50 Other 基因重新富集发现，其仍显著富集于上皮细胞分化、上皮发育、组织发育、雌激素信号通路和细胞群体增殖等过程。SHAP 与 CNN saliency 共识基因的类别交叉分析显示，Top50 共识基因主要落在 Development/Epithelium 和 Other 中，其次是 Cell cycle/Proliferation、Signaling/Transport 和 Hormone/Metabolism。配对检验未显示大多数功能类别遮盖与基线之间存在稳健显著差异；折级指标见补充材料表 S16，配对检验见补充材料表 S17，Other 类二次富集见补充材料表 S18，共识基因重叠见补充材料表 S19。</w:t>
+        <w:t>为区分“功能模块特异性贡献”与“特征数量/区域大小效应”，对 mRNA 每个类别设置同数量随机基因遮盖对照。结果显示，功能类别遮盖与等量随机遮盖的性能差异在多数比较中未达到显著水平。对 mRNA PAM50 Other 基因重新富集发现，其仍显著富集于上皮细胞分化、上皮发育、组织发育、雌激素信号通路和细胞群体增殖等过程。SHAP 与 CNN saliency 共识基因的类别交叉分析显示，Top50 共识基因主要落在 Development/Epithelium 和 Other 中，其次是 Cell cycle/Proliferation、Signaling/Transport 和 Hormone/Metabolism。配对检验未显示大多数功能类别遮盖与基线之间存在稳健显著差异；折级指标见补充材料表 S18，配对检验见补充材料表 S19，Other 类二次富集见补充材料表 S20，共识基因重叠见补充材料表 S21。</w:t>
       </w:r>
     </w:p>
     <w:p>
@@ -4555,7 +4555,7 @@
           <w:b w:val="0"/>
           <w:sz w:val="22"/>
         </w:rPr>
-        <w:t>面向 Molecular Stress Responses and Adaptive Reprogramming 这一目标主题，本研究在全转录组层面进一步考察了 Hypoxia、ROS、OXPHOS、UPR、mTORC1、Glycolysis、EMT 和 DNA repair 八条应激/适应性重编程通路与 JSD 高重要性基因、PAM50 亚型及生存风险的关系。结果显示，这些通路在 PAM50 任务的前 500 个 JSD 高重要性基因中均未显著富集（mTORC1 的 Fisher p=0.063 为边缘结果，其余 p≥0.32），单变量 Cox 分析也未发现任一通路评分与总生存显著相关（DNA repair HR 0.789、p=0.104 为最强但未达显著）。通路评分在 PAM50 亚型间高度差异（Kruskal-Wallis p&lt;0.001），但这在表达定义亚型的背景下是预期现象。因此，在当前的 bulk 表达、精选标志基因框架下，尚未观察到这些经典应激通路对判别或预后的独立贡献；相关结果应作为探索性阴性发现，并提示后续需在单细胞、空间转录组或通路过表达/敲低层面进一步验证。乳腺癌转移中的翻译适应与应激重编程机制为后续研究提供了更广的生物学背景[49]。</w:t>
+        <w:t>面向 Molecular Stress Responses and Adaptive Reprogramming 这一目标主题，本研究在全转录组层面进一步考察了 Hypoxia、ROS、OXPHOS、UPR、mTORC1、Glycolysis、EMT 和 DNA repair 八条应激/适应性重编程通路与 JSD 高重要性基因、PAM50 亚型及生存风险的关系。结果显示，这些通路在前 500 个 JSD 高重要性基因中均未达到名义显著性富集（Fisher p 经 BH-FDR 校正后均不显著），单变量 Cox 分析也未发现任一通路评分与总生存显著相关。通路评分在 PAM50 亚型间高度差异（Kruskal-Wallis p&lt;0.001），但这在表达定义亚型的背景下是预期现象。因此，在当前的 bulk 表达和紧凑型标志基因签名框架下，尚未观察到这些经典应激通路对判别或预后的独立贡献；相关结果应作为探索性阴性发现，并提示后续需在单细胞、空间转录组或通路过表达/敲低层面进一步验证。乳腺癌转移中的翻译适应与应激重编程机制为后续研究提供了更广的生物学背景[49]。</w:t>
       </w:r>
     </w:p>
     <w:p>
@@ -4646,7 +4646,7 @@
           <w:b w:val="0"/>
           <w:sz w:val="22"/>
         </w:rPr>
-        <w:t>本研究建立了 JSD 引导的组学图像化与多组学融合框架，能够同时支持乳腺癌 PAM50 四分类和总生存预测。mRNA 单组学在分子分型重建（subtype reconstruction）中表现最优，且其判别信息并非主要依赖经典 PAM50 基因面板；生存预测更依赖多组学互补。FullSizeCNN 为组学图像化提供了轻量、可解释的基线。未来可在外部数据和更稳健融合策略下进一步验证。</w:t>
+        <w:t>本研究建立了 JSD 引导的组学图像化与多组学融合框架，能够同时支持乳腺癌 PAM50 亚型重建和生存风险排序评估。mRNA 单组学在亚型重建中表现最优，且其判别信息并非主要依赖经典 PAM50 基因面板；多组学融合在生存风险建模中表现出数值提升但未达到统计显著，提示存在需要独立验证的潜在互补信息。FullSizeCNN 为组学图像化提供了轻量、可解释的基线。未来可在外部数据和更稳健融合策略下进一步验证。</w:t>
       </w:r>
     </w:p>
     <w:p>

</xml_diff>

<commit_message>
Add in-text references for all main figures and tables
</commit_message>
<xml_diff>
--- a/docs/Supervised_distribution_divergence_guided_omics_imaging_manuscript_CN.docx
+++ b/docs/Supervised_distribution_divergence_guided_omics_imaging_manuscript_CN.docx
@@ -362,7 +362,7 @@
           <w:b w:val="0"/>
           <w:sz w:val="22"/>
         </w:rPr>
-        <w:t>本部分仅给出核心方法与参数。具体样本清单见补充材料表 S1；特征筛选算法组合见表 S2，最终特征数量见表 S3；单组学全部结果见表 S4，交集单组学基线见表 S5；三组学融合结果见表 S6，两两组学融合结果见表 S7，Stacking 与复杂方法结果见表 S8–S9；融合统计检验见表 S10；图像化结构对比见表 S11–S13；全尺寸卷积 Dense 等价基线见表 S14 与图 S3；随机排列排序对照见表 S15 与图 S4；可解释性补充图见图 S5–S13；方案2功能类别遮盖与统计检验见表 S16–S21；应激与适应性重编程通路分析见表 S22 与图 S14；PAM50 50 基因剔除敏感性分析见表 S23 与图 S15。</w:t>
+        <w:t>本部分仅给出核心方法与参数。整体技术路线见图 1，样本量概况见表 1；具体样本清单见补充材料表 S1；特征筛选算法组合见表 S2，最终特征数量见表 S3；单组学全部结果见表 S4，交集单组学基线见表 S5；三组学融合结果见表 S6，两两组学融合结果见表 S7，Stacking 与复杂方法结果见表 S8–S9；融合统计检验见表 S10；图像化结构对比见表 S11–S13；全尺寸卷积 Dense 等价基线见表 S14 与图 S3；随机排列排序对照见表 S15 与图 S4；可解释性补充图见图 S5–S13；方案2功能类别遮盖与统计检验见表 S16–S21；应激与适应性重编程通路分析见表 S22 与图 S14；PAM50 50 基因剔除敏感性分析见表 S23 与图 S15。</w:t>
       </w:r>
     </w:p>
     <w:p>
@@ -1190,7 +1190,7 @@
           <w:b w:val="0"/>
           <w:sz w:val="22"/>
         </w:rPr>
-        <w:t>特征数量通过 200/50/200 基础数量及 2×、3×、4×、5× 扩增进行系统比较。最终 PAM50 数据集特征数分别为 mRNA 400、CNV 50、miRNA 600；生存数据集特征数分别为 mRNA 200、CNV 150、miRNA 600。选择依据为在 Accuracy/Macro-F1 或 ROC AUC/C-index 接近最优时，优先选择计算效率更高、稳定性更好的特征数；最终特征数量与图像尺寸对应关系见补充材料表 S3。</w:t>
+        <w:t>特征数量通过 200/50/200 基础数量及 2×、3×、4×、5× 扩增进行系统比较。最终 PAM50 数据集特征数分别为 mRNA 400、CNV 50、miRNA 600；生存数据集特征数分别为 mRNA 200、CNV 150、miRNA 600。选择依据为在 Accuracy/Macro-F1 或 ROC AUC/C-index 接近最优时，优先选择计算效率更高、稳定性更好的特征数；最终特征数量与 JSD 图像尺寸见表 2，更详细对应关系见补充材料表 S3。</w:t>
       </w:r>
     </w:p>
     <w:p>
@@ -2573,7 +2573,7 @@
           <w:b w:val="0"/>
           <w:sz w:val="22"/>
         </w:rPr>
-        <w:t>FullSizeCNN 的输入为 H×W×1 图像，第一层使用与 H×W 相同的全尺寸卷积核，输出 32 个 1×1 特征图；随后展平为 32 维向量，经 64 维全连接、ReLU 和 Dropout 后输出分类 logits 或生存风险。需要指出，该全尺寸卷积核在数学上等价于展平后的全连接投影，因此本文将其视为保留图像坐标接口的 full-field convolutional network，而不是滑动/局部卷积特征提取器；其图像接口主要用于后续归因可视化，而非依赖二维局部感受野获得预测增益。</w:t>
+        <w:t>FullSizeCNN 的输入为 H×W×1 图像，第一层使用与 H×W 相同的全尺寸卷积核，输出 32 个 1×1 特征图；随后展平为 32 维向量，经 64 维全连接、ReLU 和 Dropout 后输出分类 logits 或生存风险。结构如图 2 所示。需要指出，该全尺寸卷积核在数学上等价于展平后的全连接投影，因此本文将其视为保留图像坐标接口的 full-field convolutional network，而不是滑动/局部卷积特征提取器；其图像接口主要用于后续归因可视化，而非依赖二维局部感受野获得预测增益。</w:t>
       </w:r>
     </w:p>
     <w:p>
@@ -4061,7 +4061,7 @@
           <w:b w:val="0"/>
           <w:sz w:val="22"/>
         </w:rPr>
-        <w:t>在复杂方法中，Transformer 在 PAM50 上表现较好（Accuracy 0.9270、Macro-F1 0.9288），但生存 C-index 为 0.6938；Multi-task、DeepSurv、低秩双线性和 GNN 未在当前小样本上显示出稳定提升。</w:t>
+        <w:t>在复杂方法中，Transformer 在 PAM50 上表现较好（Accuracy 0.9270、Macro-F1 0.9288），但生存 C-index 为 0.6938；Multi-task、DeepSurv、低秩双线性和 GNN 未在当前小样本上显示出稳定提升。Figure 6 汇总了这些复杂方法的 PAM50 与生存结果。</w:t>
       </w:r>
     </w:p>
     <w:p>
@@ -4213,6 +4213,21 @@
     </w:p>
     <w:p>
       <w:pPr>
+        <w:spacing w:after="120" w:line="300" w:lineRule="auto"/>
+        <w:ind w:firstLine="440"/>
+        <w:jc w:val="both"/>
+      </w:pPr>
+      <w:r>
+        <w:rPr>
+          <w:rFonts w:ascii="Times New Roman" w:hAnsi="Times New Roman" w:eastAsia="宋体" w:cs="Times New Roman"/>
+          <w:b w:val="0"/>
+          <w:sz w:val="22"/>
+        </w:rPr>
+        <w:t>为进一步说明 JSD 图像化如何把表达值、判别重要性和功能注释统一到同一像素坐标系，Figure 7 将同一 mRNA 样本的表达灰度图（A）、JSD 重要性图（B）和功能类别图（C）并列，并将 SHAP 重要性（D）、CNN saliency（E）及功能类别/saliency 叠加图（F）映射回相同坐标。这样，模型归因和关键因子能够直接定位到对应的基因像素，而不只是在表格层面输出一个基因列表。</w:t>
+      </w:r>
+    </w:p>
+    <w:p>
+      <w:pPr>
         <w:keepNext/>
         <w:spacing w:before="100" w:after="20"/>
         <w:jc w:val="center"/>
@@ -4294,7 +4309,7 @@
           <w:b w:val="0"/>
           <w:sz w:val="22"/>
         </w:rPr>
-        <w:t>为进一步解释组学图像中不同功能区域对模型的贡献，本研究在方案2（功能大类分块 + 中心高重要性 + 中心向外螺旋填充）图像上实施功能类别遮盖实验。与最初的 JSD 全局排序图像不同，方案2先按基因功能类别分块，再在块内按 JSD 降序，并以块平均重要性由中心向外螺旋填充，因此同一颜色区域对应同一功能模块，中心区域对应高 JSD 模块。该设计使图像像素邻接具有更明确的生物学含义，并支持对连续功能区域进行模块级遮挡。</w:t>
+        <w:t>为进一步解释组学图像中不同功能区域对模型的贡献，本研究在方案2（功能大类分块 + 中心高重要性 + 中心向外螺旋填充）图像上实施功能类别遮盖实验。与最初的 JSD 全局排序图像不同，方案2先按基因功能类别分块，再在块内按 JSD 降序，并以块平均重要性由中心向外螺旋填充，因此同一颜色区域对应同一功能模块，中心区域对应高 JSD 模块。该设计使图像像素邻接具有更明确的生物学含义，并支持对连续功能区域进行模块级遮挡；遮盖流程如图 8 所示。</w:t>
       </w:r>
     </w:p>
     <w:p>
@@ -4364,7 +4379,7 @@
           <w:b w:val="0"/>
           <w:sz w:val="22"/>
         </w:rPr>
-        <w:t>对 mRNA、CNV 和 miRNA 分别遮盖 Development/Epithelium、Signaling/Transport、Hormone/Metabolism、Cell cycle/Proliferation 和 Other 等类别。mRNA PAM50 基线 Accuracy 为 0.9244±0.0124，Macro-F1 为 0.9069±0.0133；遮盖 Other 后 Macro-F1 降至 0.8819±0.0210。mRNA 生存基线 C-index 为 0.6984±0.0756，遮盖 Other 后降至 0.6757±0.0715。CNV 和 miRNA 同样显示 Other 类遮盖后性能下降最明显，但由于 Other 类特征数量较多，下降幅度同时受模块大小影响；mRNA 结果见补充材料表 S16，CNV/miRNA 结果见补充材料表 S17。</w:t>
+        <w:t>对 mRNA、CNV 和 miRNA 分别遮盖 Development/Epithelium、Signaling/Transport、Hormone/Metabolism、Cell cycle/Proliferation 和 Other 等类别。mRNA PAM50 基线 Accuracy 为 0.9244±0.0124，Macro-F1 为 0.9069±0.0133；遮盖 Other 后 Macro-F1 降至 0.8819±0.0210。mRNA 生存基线 C-index 为 0.6984±0.0756，遮盖 Other 后降至 0.6757±0.0715。CNV 和 miRNA 同样显示 Other 类遮盖后性能下降最明显，但由于 Other 类特征数量较多，下降幅度同时受模块大小影响；CNV 与 miRNA 的遮盖结果见图 9，mRNA 结果见补充材料表 S16，CNV/miRNA 结果见补充材料表 S17。</w:t>
       </w:r>
     </w:p>
     <w:p>

</xml_diff>

<commit_message>
Add nested CV, FullSizeCNN-Cox, and strict PAM50 exclusion robustness
</commit_message>
<xml_diff>
--- a/docs/Supervised_distribution_divergence_guided_omics_imaging_manuscript_CN.docx
+++ b/docs/Supervised_distribution_divergence_guided_omics_imaging_manuscript_CN.docx
@@ -362,7 +362,7 @@
           <w:b w:val="0"/>
           <w:sz w:val="22"/>
         </w:rPr>
-        <w:t>本部分仅给出核心方法与参数。整体技术路线见图 1，样本量概况见表 1；具体样本清单见补充材料表 S1；特征筛选算法组合见表 S2，最终特征数量见表 S3；单组学全部结果见表 S4，交集单组学基线见表 S5；三组学融合结果见表 S6，两两组学融合结果见表 S7，Stacking 与复杂方法结果见表 S8–S9；融合统计检验见表 S10；图像化结构对比见表 S11–S13；全尺寸卷积 Dense 等价基线见表 S14 与图 S3；随机排列排序对照见表 S15 与图 S4；可解释性补充图见图 S5–S13；方案2功能类别遮盖与统计检验见表 S16–S21；应激与适应性重编程通路分析见表 S22 与图 S14；PAM50 50 基因剔除敏感性分析见表 S23 与图 S15。</w:t>
+        <w:t>本部分仅给出核心方法与参数。整体技术路线见图 1，样本量概况见表 1；具体样本清单见补充材料表 S1；特征筛选算法组合见表 S2，最终特征数量见表 S3；单组学全部结果见表 S4，交集单组学基线见表 S5；三组学融合结果见表 S6，两两组学融合结果见表 S7，Stacking 与复杂方法结果见表 S8–S9；融合统计检验见表 S10；图像化结构对比见表 S11–S13；全尺寸卷积 Dense 等价基线见表 S14 与图 S3；随机排列排序对照见表 S15 与图 S4；可解释性补充图见图 S5–S13；方案2功能类别遮盖与统计检验见表 S16–S21；应激与适应性重编程通路分析见表 S22 与图 S14；PAM50 50 基因剔除敏感性分析见表 S23 与图 S15；无泄漏嵌套交叉验证见表 S24，严格 PAM50 排除见表 S25，FullSizeCNN-Cox 见表 S26。</w:t>
       </w:r>
     </w:p>
     <w:p>
@@ -2797,7 +2797,7 @@
           <w:b w:val="0"/>
           <w:sz w:val="22"/>
         </w:rPr>
-        <w:t>正文展示代表性结果；完整逐模型、逐折均值和标准差见补充材料表 S4–S23。</w:t>
+        <w:t>正文展示代表性结果；完整逐模型、逐折均值和标准差见补充材料表 S4–S26。</w:t>
       </w:r>
     </w:p>
     <w:p>
@@ -4570,6 +4570,21 @@
           <w:b w:val="0"/>
           <w:sz w:val="22"/>
         </w:rPr>
+        <w:t>为控制特征数量选择与最终评估共用同一交叉验证可能带来的选择偏倚，本研究进一步在 mRNA PAM50 上进行了无泄漏嵌套交叉验证：外层 5-fold × 5 repeats，内层 3-fold 选择特征数（200/400），特征筛选采用 V_L1，并在所选特征上按 JSD 排序生成 FullSizeCNN 图像。结果显示，LogisticRegression 的 Accuracy 为 0.8392±0.0288，FullSizeCNN 为 0.8510±0.0282，Dense 等价基线为 0.8449±0.0326；三者均低于正文基于最终 400 特征的结果，且 FullSizeCNN 与 Dense 的差异未超过交叉验证标准差。这再次表明，二维空间布局本身并未提供稳定的预测增益，正文结果应理解为基于训练折内预选特征的 exploratory CV estimate；完整结果见补充材料表 S24–S26。</w:t>
+      </w:r>
+    </w:p>
+    <w:p>
+      <w:pPr>
+        <w:spacing w:after="120" w:line="300" w:lineRule="auto"/>
+        <w:ind w:firstLine="440"/>
+        <w:jc w:val="both"/>
+      </w:pPr>
+      <w:r>
+        <w:rPr>
+          <w:rFonts w:ascii="Times New Roman" w:hAnsi="Times New Roman" w:eastAsia="宋体" w:cs="Times New Roman"/>
+          <w:b w:val="0"/>
+          <w:sz w:val="22"/>
+        </w:rPr>
         <w:t>面向 Molecular Stress Responses and Adaptive Reprogramming 这一目标主题，本研究在全转录组层面进一步考察了 Hypoxia、ROS、OXPHOS、UPR、mTORC1、Glycolysis、EMT 和 DNA repair 八条应激/适应性重编程通路与 JSD 高重要性基因、PAM50 亚型及生存风险的关系。结果显示，这些通路在前 500 个 JSD 高重要性基因中均未达到名义显著性富集（Fisher p 经 BH-FDR 校正后均不显著），单变量 Cox 分析也未发现任一通路评分与总生存显著相关。通路评分在 PAM50 亚型间高度差异（Kruskal-Wallis p&lt;0.001），但这在表达定义亚型的背景下是预期现象。因此，在当前的 bulk 表达和紧凑型标志基因签名框架下，尚未观察到这些经典应激通路对判别或预后的独立贡献；相关结果应作为探索性阴性发现，并提示后续需在单细胞、空间转录组或通路过表达/敲低层面进一步验证。乳腺癌转移中的翻译适应与应激重编程机制为后续研究提供了更广的生物学背景[49]。</w:t>
       </w:r>
     </w:p>

</xml_diff>

<commit_message>
Address latest reviewer feedback on nested CV interpretation and terminology
</commit_message>
<xml_diff>
--- a/docs/Supervised_distribution_divergence_guided_omics_imaging_manuscript_CN.docx
+++ b/docs/Supervised_distribution_divergence_guided_omics_imaging_manuscript_CN.docx
@@ -90,7 +90,7 @@
           <w:b w:val="0"/>
           <w:sz w:val="21"/>
         </w:rPr>
-        <w:t>方法：本研究以 TCGA-BRCA 的 mRNA、CNV 和 miRNA 为对象，提出一种监督式分布散度引导的组学空间表示框架（supervised information-divergence-guided omics spatial representation framework），即以 Jensen–Shannon divergence（JSD）评估每个特征的判别重要性，并将其编码为可解释的空间表示。所有特征筛选、标准化和模型拟合均在 5 折交叉验证训练折内完成；按 JSD 重要性降序并将高分特征置于中心，采用中心向外螺旋填充形成单通道灰度图，再输入全尺寸卷积神经网络（FullSizeCNN）。同时比较 LogisticRegression、RandomForest、GradientBoosting、SVC、KNN、MLP、CoxPH 及多种多组学融合策略。</w:t>
+        <w:t>方法：本研究以 TCGA-BRCA 的 mRNA、CNV 和 miRNA 为对象，提出一种监督式分布散度引导的组学空间表示框架（supervised information-divergence-guided omics spatial representation framework），即以 Jensen–Shannon divergence（JSD）评估每个特征的判别重要性，并将其编码为可解释的空间表示。固定特征数配置下，特征提取、标准化和模型拟合均在 5 折交叉验证训练折内完成；主分析的特征数选择与最终评估共用同一交叉验证，因此作为探索性估计，并以 nested repeated CV 进行敏感性分析。按 JSD 重要性降序并将高分特征置于中心，采用中心向外螺旋填充形成单通道灰度图，再输入全尺寸卷积神经网络（FullSizeCNN）。同时比较 LogisticRegression、RandomForest、GradientBoosting、SVC、KNN、MLP、CoxPH 及多种多组学融合策略。</w:t>
       </w:r>
     </w:p>
     <w:p>
@@ -105,7 +105,7 @@
           <w:b w:val="0"/>
           <w:sz w:val="21"/>
         </w:rPr>
-        <w:t>结果：在单组学 PAM50 四分类中，mRNA LogisticRegression 的 Accuracy 为 0.9628±0.0167、Macro-F1 为 0.9575±0.0199；CNV 最优 MLP 为 0.7213±0.0156；miRNA 最优 LogisticRegression 为 0.8410±0.0120。生存风险建模中，mRNA FullSizeCNN 的 C-index 为 0.7125±0.0303，CNV CoxPH 为 0.7109±0.0339，miRNA FullSizeCNN 为 0.6067±0.0703。多组学整合中，PAM50 的 Transformer 达到 Accuracy 0.9270±0.0132、Macro-F1 0.9288±0.0128；生存风险建模的三组学 Concat MLP 达到 C-index 0.7588±0.0492，CNN 晚期平均融合达到 ROC AUC 0.7591±0.0619。配对检验显示，上述最优融合均未较对应最优单组学形成统计显著优势（所有配对检验 p≥0.093）。Dense-equivalent controls performed comparably to or better than FullSizeCNN, while JSD-guided spiral ordering did not significantly outperform random permutations, indicating that the principal value of imaging was interpretability rather than predictive gain。可解释分析识别出 ESR1、TFF1、AGR3、FOXC1、MIA、FABP7、CCL19、MS4A1 等关键因子，富集于雌激素信号、细胞增殖调控、细胞分裂和上皮发育等通路。方案2功能类别遮盖分析在控制特征集合大小后，未能建立稳健的类别特异效应。</w:t>
+        <w:t>结果：在单组学 PAM50 四分类的探索性 5 折交叉验证中，mRNA LogisticRegression 的 Accuracy 为 0.9628±0.0167、Macro-F1 为 0.9575±0.0199；CNV 最优 MLP 为 0.7213±0.0156；miRNA 最优 LogisticRegression 为 0.8410±0.0120。无泄漏 nested repeated CV 中，mRNA PAM50 的 LogisticRegression、Dense 和 FullSizeCNN Accuracy 分别为 0.8392、0.8449 和 0.8510，说明性能对特征筛选与建模流程敏感。生存风险建模中，mRNA FullSizeCNN 的 C-index 为 0.7125±0.0303，CNV CoxPH 为 0.7109±0.0339，miRNA FullSizeCNN 为 0.6067±0.0703。多组学整合中，PAM50 的 Transformer 达到 Accuracy 0.9270±0.0132、Macro-F1 0.9288±0.0128；生存风险建模的三组学 Concat MLP 达到 C-index 0.7588±0.0492，CNN 晚期平均融合达到 ROC AUC 0.7591±0.0619。配对检验未提供存在统计可检测差异的证据（所有 p≥0.093）。Dense-equivalent controls performed comparably to or better than FullSizeCNN, while JSD-guided spiral ordering did not significantly outperform random permutations, indicating that the principal value of imaging was interpretability rather than predictive gain。可解释分析识别出 ESR1、TFF1、AGR3、FOXC1、MIA、FABP7、CCL19、MS4A1 等关键因子，富集于雌激素信号、细胞增殖调控、细胞分裂和上皮发育等通路。方案2功能类别遮盖分析在控制特征集合大小后，未能建立稳健的类别特异效应。</w:t>
       </w:r>
     </w:p>
     <w:p>
@@ -1124,7 +1124,7 @@
           <w:b w:val="0"/>
           <w:sz w:val="22"/>
         </w:rPr>
-        <w:t>低方差过滤首先移除训练折内方差为零或近似常数的特征；F 值采用单因素 ANOVA 比较连续特征在不同类别间均值差异；L1/LASSO 通过线性支持向量机的稀疏系数进行嵌入式选择。三种方法分别从稳定性、线性判别和稀疏正则化角度降低维度。特征筛选算法组合方式见补充材料表 S2。</w:t>
+        <w:t>低方差过滤首先移除训练折内方差为零或近似常数的特征；F 值采用单因素 ANOVA 比较连续特征在不同类别间均值差异；L1 嵌入式选择使用线性支持向量机 LinearSVC(penalty='l1', dual=False, C=0.1, max_iter=5000) 的稀疏系数。三种方法分别从稳定性、线性判别和稀疏正则化角度降低维度。特征筛选算法组合方式见补充材料表 S2。</w:t>
       </w:r>
     </w:p>
     <w:p>
@@ -1140,7 +1140,7 @@
           <w:rFonts w:ascii="Cambria Math" w:hAnsi="Cambria Math" w:eastAsia="宋体" w:cs="Cambria Math"/>
           <w:sz w:val="21"/>
         </w:rPr>
-        <w:t>Var(x_j) = (1/N) ∑_i (x_ij - x̄_j)²;  F_j = MS_between / MS_within;  min_w (1/2) ||Xw - y||² + λ ||w||₁</w:t>
+        <w:t>Var(x_j) = (1/N) ∑_i (x_ij - x̄_j)²;  F_j = MS_between / MS_within</w:t>
         <w:tab/>
         <w:t>(1)</w:t>
       </w:r>
@@ -1205,7 +1205,7 @@
           <w:b w:val="0"/>
           <w:sz w:val="22"/>
         </w:rPr>
-        <w:t>需要说明的是，特征数量的选择与最终性能评估共用同一 5 折交叉验证，因此本文报告的 Accuracy、Macro-F1、ROC AUC 与 C-index 属于探索性交叉验证估计（exploratory CV estimates），可能存在对最优特征数量的选择偏倚。受限于样本量，本文未另行构造嵌套交叉验证或独立验证集；最终特征数量应视为便于后续统一建模与比较的工作性设定，而非经过严格无偏验证的超参数。</w:t>
+        <w:t>需要说明的是，主分析中特征数量的选择与最终性能评估共用同一 5 折交叉验证，因此本文报告的 Accuracy、Macro-F1、ROC AUC 与 C-index 属于探索性交叉验证估计（exploratory CV estimates），可能存在对最优特征数量的选择偏倚。为评估该偏倚的大小，本文对 mRNA PAM50 关键模型增加了无泄漏 nested repeated CV：外层 5-fold × 5 repeats，内层 3-fold 选择特征数（200/400），特征筛选和图像排序均仅在训练折内完成；完整结果见补充材料表 S24。</w:t>
       </w:r>
     </w:p>
     <w:p>
@@ -4585,6 +4585,21 @@
           <w:b w:val="0"/>
           <w:sz w:val="22"/>
         </w:rPr>
+        <w:t>为区分死亡状态分类与严格时间到事件建模，本研究进一步将 FullSizeCNN 输出层替换为 Cox partial-likelihood objective，得到 FullSizeCNN-Cox 的 C-index 为 0.6818±0.0401，低于 BCE-based FullSizeCNN 的 0.7125±0.0303。这表明当前图像表示在严格删失感知生存建模下仍保留一定风险排序信息，但未显示出相对于传统时间到事件模型的明确优势；相关结果见补充材料表 S26。</w:t>
+      </w:r>
+    </w:p>
+    <w:p>
+      <w:pPr>
+        <w:spacing w:after="120" w:line="300" w:lineRule="auto"/>
+        <w:ind w:firstLine="440"/>
+        <w:jc w:val="both"/>
+      </w:pPr>
+      <w:r>
+        <w:rPr>
+          <w:rFonts w:ascii="Times New Roman" w:hAnsi="Times New Roman" w:eastAsia="宋体" w:cs="Times New Roman"/>
+          <w:b w:val="0"/>
+          <w:sz w:val="22"/>
+        </w:rPr>
         <w:t>面向 Molecular Stress Responses and Adaptive Reprogramming 这一目标主题，本研究在全转录组层面进一步考察了 Hypoxia、ROS、OXPHOS、UPR、mTORC1、Glycolysis、EMT 和 DNA repair 八条应激/适应性重编程通路与 JSD 高重要性基因、PAM50 亚型及生存风险的关系。结果显示，这些通路在前 500 个 JSD 高重要性基因中均未达到名义显著性富集（Fisher p 经 BH-FDR 校正后均不显著），单变量 Cox 分析也未发现任一通路评分与总生存显著相关。通路评分在 PAM50 亚型间高度差异（Kruskal-Wallis p&lt;0.001），但这在表达定义亚型的背景下是预期现象。因此，在当前的 bulk 表达和紧凑型标志基因签名框架下，尚未观察到这些经典应激通路对判别或预后的独立贡献；相关结果应作为探索性阴性发现，并提示后续需在单细胞、空间转录组或通路过表达/敲低层面进一步验证。乳腺癌转移中的翻译适应与应激重编程机制为后续研究提供了更广的生物学背景[49]。</w:t>
       </w:r>
     </w:p>
@@ -4630,7 +4645,7 @@
           <w:b w:val="0"/>
           <w:sz w:val="22"/>
         </w:rPr>
-        <w:t>局限包括：仅使用 TCGA-BRCA 单中心回顾性数据，缺少独立外部队列；生存事件数量较少，类别不平衡；螺旋位置仍然不是真实生物学空间；复杂模型可能过拟合。统计推断方面，配对检验仅基于 5 折（n=5）的折级分数，统计功效有限，且未进行多重比较校正，因此边缘显著结果（如生存 ROC AUC 的配对 t 检验 p=0.093）需要谨慎解释；后续应采用 repeated CV、bootstrap 置信区间或折级效应量（如 Cohen's d）来增强证据强度。此外，特征数量选择与最终评估共用同一交叉验证，存在选择偏倚，理想情况下应使用嵌套交叉验证或独立验证集。</w:t>
+        <w:t>局限包括：仅使用 TCGA-BRCA 单一回顾性队列，缺少独立外部队列验证；生存事件数量较少，类别不平衡；螺旋位置仍然不是真实生物学空间；复杂模型可能过拟合。统计推断方面，配对检验仅基于 5 折（n=5）的折级分数，统计功效有限，且未进行多重比较校正，因此 non-significant numerical differences（如生存 ROC AUC 的配对 t 检验 p=0.093）不应被解释为“两者无差异”；后续应采用 repeated CV、bootstrap 置信区间或折级效应量（如 Cohen's d）来增强证据强度。此外，主分析的特征数量选择与最终评估共用同一交叉验证，存在选择偏倚；虽然已对 mRNA PAM50 任务进行了 nested repeated-CV 敏感性分析，但主要多组学融合分析尚未在 nested CV 下全面重新评估，独立外部验证仍然必要。</w:t>
       </w:r>
     </w:p>
     <w:p>

</xml_diff>

<commit_message>
Add nested CV design figure and method comparison/effect-size tables
</commit_message>
<xml_diff>
--- a/docs/Supervised_distribution_divergence_guided_omics_imaging_manuscript_CN.docx
+++ b/docs/Supervised_distribution_divergence_guided_omics_imaging_manuscript_CN.docx
@@ -362,7 +362,7 @@
           <w:b w:val="0"/>
           <w:sz w:val="22"/>
         </w:rPr>
-        <w:t>本部分仅给出核心方法与参数。整体技术路线见图 1，样本量概况见表 1；具体样本清单见补充材料表 S1；特征筛选算法组合见表 S2，最终特征数量见表 S3；单组学全部结果见表 S4，交集单组学基线见表 S5；三组学融合结果见表 S6，两两组学融合结果见表 S7，Stacking 与复杂方法结果见表 S8–S9；融合统计检验见表 S10；图像化结构对比见表 S11–S13；全尺寸卷积 Dense 等价基线见表 S14 与图 S3；随机排列排序对照见表 S15 与图 S4；可解释性补充图见图 S5–S13；方案2功能类别遮盖与统计检验见表 S16–S21；应激与适应性重编程通路分析见表 S22 与图 S14；PAM50 50 基因剔除敏感性分析见表 S23 与图 S15；无泄漏嵌套交叉验证见表 S24，严格 PAM50 排除见表 S25，FullSizeCNN-Cox 见表 S26。</w:t>
+        <w:t>本部分仅给出核心方法与参数。整体技术路线见图 1，样本量概况见表 1；具体样本清单见补充材料表 S1；特征筛选算法组合见表 S2，最终特征数量见表 S3；单组学全部结果见表 S4，交集单组学基线见表 S5；三组学融合结果见表 S6，两两组学融合结果见表 S7，Stacking 与复杂方法结果见表 S8–S9；融合统计检验见表 S10；图像化结构对比见表 S11–S13；全尺寸卷积 Dense 等价基线见表 S14 与图 S3；随机排列排序对照见表 S15 与图 S4；可解释性补充图见图 S5–S13；方案2功能类别遮盖与统计检验见表 S16–S21；应激与适应性重编程通路分析见表 S22 与图 S14；PAM50 50 基因剔除敏感性分析见表 S23 与图 S15；无泄漏嵌套交叉验证见表 S24 与图 S16，严格 PAM50 排除见表 S25，FullSizeCNN-Cox 见表 S26，统计效应量见表 S27，已有方法比较见表 S28。</w:t>
       </w:r>
     </w:p>
     <w:p>
@@ -2797,7 +2797,7 @@
           <w:b w:val="0"/>
           <w:sz w:val="22"/>
         </w:rPr>
-        <w:t>正文展示代表性结果；完整逐模型、逐折均值和标准差见补充材料表 S4–S26。</w:t>
+        <w:t>正文展示代表性结果；完整逐模型、逐折均值和标准差见补充材料表 S4–S28。</w:t>
       </w:r>
     </w:p>
     <w:p>

</xml_diff>

<commit_message>
Add METABRIC external single-omics validation
</commit_message>
<xml_diff>
--- a/docs/Supervised_distribution_divergence_guided_omics_imaging_manuscript_CN.docx
+++ b/docs/Supervised_distribution_divergence_guided_omics_imaging_manuscript_CN.docx
@@ -362,7 +362,7 @@
           <w:b w:val="0"/>
           <w:sz w:val="22"/>
         </w:rPr>
-        <w:t>本部分仅给出核心方法与参数。整体技术路线见图 1，样本量概况见表 1；具体样本清单见补充材料表 S1；特征筛选算法组合见表 S2，最终特征数量见表 S3；单组学全部结果见表 S4，交集单组学基线见表 S5；三组学融合结果见表 S6，两两组学融合结果见表 S7，Stacking 与复杂方法结果见表 S8–S9；融合统计检验见表 S10；图像化结构对比见表 S11–S13；全尺寸卷积 Dense 等价基线见表 S14 与图 S3；随机排列排序对照见表 S15 与图 S4；可解释性补充图见图 S5–S13；方案2功能类别遮盖与统计检验见表 S16–S21；应激与适应性重编程通路分析见表 S22 与图 S14；PAM50 50 基因剔除敏感性分析见表 S23 与图 S15；无泄漏嵌套交叉验证见表 S24 与图 S16，严格 PAM50 排除见表 S25，FullSizeCNN-Cox 见表 S26，统计效应量见表 S27，已有方法比较见表 S28。</w:t>
+        <w:t>本部分仅给出核心方法与参数。整体技术路线见图 1，样本量概况见表 1；具体样本清单见补充材料表 S1；特征筛选算法组合见表 S2，最终特征数量见表 S3；单组学全部结果见表 S4，交集单组学基线见表 S5；三组学融合结果见表 S6，两两组学融合结果见表 S7，Stacking 与复杂方法结果见表 S8–S9；融合统计检验见表 S10；图像化结构对比见表 S11–S13；全尺寸卷积 Dense 等价基线见表 S14 与图 S3；随机排列排序对照见表 S15 与图 S4；可解释性补充图见图 S5–S13；方案2功能类别遮盖与统计检验见表 S16–S21；应激与适应性重编程通路分析见表 S22 与图 S14；PAM50 50 基因剔除敏感性分析见表 S23 与图 S15；无泄漏嵌套交叉验证见表 S24 与图 S16，严格 PAM50 排除见表 S25，FullSizeCNN-Cox 见表 S26，统计效应量见表 S27，已有方法比较见表 S28，METABRIC 外部验证见表 S29。</w:t>
       </w:r>
     </w:p>
     <w:p>
@@ -2797,7 +2797,7 @@
           <w:b w:val="0"/>
           <w:sz w:val="22"/>
         </w:rPr>
-        <w:t>正文展示代表性结果；完整逐模型、逐折均值和标准差见补充材料表 S4–S28。</w:t>
+        <w:t>正文展示代表性结果；完整逐模型、逐折均值和标准差见补充材料表 S4–S29。</w:t>
       </w:r>
     </w:p>
     <w:p>
@@ -4645,7 +4645,7 @@
           <w:b w:val="0"/>
           <w:sz w:val="22"/>
         </w:rPr>
-        <w:t>局限包括：仅使用 TCGA-BRCA 单一回顾性队列，缺少独立外部队列验证；生存事件数量较少，类别不平衡；螺旋位置仍然不是真实生物学空间；复杂模型可能过拟合。统计推断方面，配对检验仅基于 5 折（n=5）的折级分数，统计功效有限，且未进行多重比较校正，因此 non-significant numerical differences（如生存 ROC AUC 的配对 t 检验 p=0.093）不应被解释为“两者无差异”；后续应采用 repeated CV、bootstrap 置信区间或折级效应量（如 Cohen's d）来增强证据强度。此外，主分析的特征数量选择与最终评估共用同一交叉验证，存在选择偏倚；虽然已对 mRNA PAM50 任务进行了 nested repeated-CV 敏感性分析，但主要多组学融合分析尚未在 nested CV 下全面重新评估，独立外部验证仍然必要。</w:t>
+        <w:t>局限包括：主要发现基于 TCGA-BRCA 单一回顾性队列；虽然已在 METABRIC 独立队列中进行 mRNA/CNV 单组学外部验证，但尚缺少同时包含 mRNA、CNV 和 miRNA 的完整多组学外部队列。生存事件数量较少，类别不平衡；螺旋位置仍然不是真实生物学空间；复杂模型可能过拟合。统计推断方面，配对检验仅基于 5 折（n=5）的折级分数，统计功效有限，且未进行多重比较校正，因此 non-significant numerical differences（如生存 ROC AUC 的配对 t 检验 p=0.093）不应被解释为“两者无差异”；后续应采用 repeated CV、bootstrap 置信区间或折级效应量（如 Cohen's d）来增强证据强度。此外，主分析的特征数量选择与最终评估共用同一交叉验证，存在选择偏倚；虽然已对 mRNA PAM50 任务进行了 nested repeated-CV 敏感性分析，但主要多组学融合分析尚未在 nested CV 下全面重新评估，独立外部验证仍然必要。</w:t>
       </w:r>
     </w:p>
     <w:p>

</xml_diff>

<commit_message>
Integrate gene interaction analysis into manuscript and supplement
</commit_message>
<xml_diff>
--- a/docs/Supervised_distribution_divergence_guided_omics_imaging_manuscript_CN.docx
+++ b/docs/Supervised_distribution_divergence_guided_omics_imaging_manuscript_CN.docx
@@ -362,7 +362,7 @@
           <w:b w:val="0"/>
           <w:sz w:val="22"/>
         </w:rPr>
-        <w:t>本部分仅给出核心方法与参数。整体技术路线见图 1，样本量概况见表 1；具体样本清单见补充材料表 S1；特征筛选算法组合见表 S2，最终特征数量见表 S3；单组学全部结果见表 S4，交集单组学基线见表 S5；三组学融合结果见表 S6，两两组学融合结果见表 S7，Stacking 与复杂方法结果见表 S8–S9；融合统计检验见表 S10；图像化结构对比见表 S11–S13；全尺寸卷积 Dense 等价基线见表 S14 与图 S3；随机排列排序对照见表 S15 与图 S4；可解释性补充图见图 S5–S13；方案2功能类别遮盖与统计检验见表 S16–S21；应激与适应性重编程通路分析见表 S22 与图 S14；PAM50 50 基因剔除敏感性分析见表 S23 与图 S15；无泄漏嵌套交叉验证见表 S24 与图 S16，严格 PAM50 排除见表 S25，FullSizeCNN-Cox 见表 S26，统计效应量见表 S27，已有方法比较见表 S28，METABRIC 外部验证见表 S29。</w:t>
+        <w:t>本部分仅给出核心方法与参数。整体技术路线见图 1，样本量概况见表 1；具体样本清单见补充材料表 S1；特征筛选算法组合见表 S2，最终特征数量见表 S3；单组学全部结果见表 S4，交集单组学基线见表 S5；三组学融合结果见表 S6，两两组学融合结果见表 S7，Stacking 与复杂方法结果见表 S8–S9；融合统计检验见表 S10；图像化结构对比见表 S11–S13；全尺寸卷积 Dense 等价基线见表 S14 与图 S3；随机排列排序对照见表 S15 与图 S4；可解释性补充图见图 S5–S13；方案2功能类别遮盖与统计检验见表 S16–S21；应激与适应性重编程通路分析见表 S22 与图 S14；PAM50 50 基因剔除敏感性分析见表 S23 与图 S15；无泄漏嵌套交叉验证见表 S24 与图 S16，严格 PAM50 排除见表 S25，FullSizeCNN-Cox 见表 S26，统计效应量见表 S27，已有方法比较见表 S28，METABRIC 外部验证见表 S29，基因互作分析见 S22 与图 S17，社区重排对比见表 S30。</w:t>
       </w:r>
     </w:p>
     <w:p>
@@ -2797,7 +2797,7 @@
           <w:b w:val="0"/>
           <w:sz w:val="22"/>
         </w:rPr>
-        <w:t>正文展示代表性结果；完整逐模型、逐折均值和标准差见补充材料表 S4–S29。</w:t>
+        <w:t>正文展示代表性结果；完整逐模型、逐折均值和标准差见补充材料表 S4–S30。</w:t>
       </w:r>
     </w:p>
     <w:p>
@@ -4600,6 +4600,21 @@
           <w:b w:val="0"/>
           <w:sz w:val="22"/>
         </w:rPr>
+        <w:t>基因互作分析进一步显示，consensus genes 主要富集于激素信号、增殖与有丝分裂相关的 STRING 互作网络；跨组学分析也识别出若干 miRNA–mRNA 负相关及 CNV–mRNA 相关候选边。然而，按共表达社区重排 mRNA 图像后，FullSizeCNN 的 Accuracy 为 0.8931，并未超过原始 JSD 螺旋排序，说明生物邻接关系能够丰富可解释性，但尚未证明其能够稳定提升当前全尺寸卷积模型的预测性能。</w:t>
+      </w:r>
+    </w:p>
+    <w:p>
+      <w:pPr>
+        <w:spacing w:after="120" w:line="300" w:lineRule="auto"/>
+        <w:ind w:firstLine="440"/>
+        <w:jc w:val="both"/>
+      </w:pPr>
+      <w:r>
+        <w:rPr>
+          <w:rFonts w:ascii="Times New Roman" w:hAnsi="Times New Roman" w:eastAsia="宋体" w:cs="Times New Roman"/>
+          <w:b w:val="0"/>
+          <w:sz w:val="22"/>
+        </w:rPr>
         <w:t>面向 Molecular Stress Responses and Adaptive Reprogramming 这一目标主题，本研究在全转录组层面进一步考察了 Hypoxia、ROS、OXPHOS、UPR、mTORC1、Glycolysis、EMT 和 DNA repair 八条应激/适应性重编程通路与 JSD 高重要性基因、PAM50 亚型及生存风险的关系。结果显示，这些通路在前 500 个 JSD 高重要性基因中均未达到名义显著性富集（Fisher p 经 BH-FDR 校正后均不显著），单变量 Cox 分析也未发现任一通路评分与总生存显著相关。通路评分在 PAM50 亚型间高度差异（Kruskal-Wallis p&lt;0.001），但这在表达定义亚型的背景下是预期现象。因此，在当前的 bulk 表达和紧凑型标志基因签名框架下，尚未观察到这些经典应激通路对判别或预后的独立贡献；相关结果应作为探索性阴性发现，并提示后续需在单细胞、空间转录组或通路过表达/敲低层面进一步验证。乳腺癌转移中的翻译适应与应激重编程机制为后续研究提供了更广的生物学背景[49]。</w:t>
       </w:r>
     </w:p>

</xml_diff>

<commit_message>
Integrate gene interaction analysis into main manuscript methods and results
</commit_message>
<xml_diff>
--- a/docs/Supervised_distribution_divergence_guided_omics_imaging_manuscript_CN.docx
+++ b/docs/Supervised_distribution_divergence_guided_omics_imaging_manuscript_CN.docx
@@ -2771,6 +2771,37 @@
     </w:p>
     <w:p>
       <w:pPr>
+        <w:pStyle w:val="Heading2"/>
+        <w:spacing w:before="240" w:after="100"/>
+        <w:jc w:val="left"/>
+      </w:pPr>
+      <w:r>
+        <w:rPr>
+          <w:rFonts w:ascii="Times New Roman" w:hAnsi="Times New Roman" w:eastAsia="微软雅黑" w:cs="Times New Roman"/>
+          <w:b/>
+          <w:color w:val="2E74B5"/>
+          <w:sz w:val="26"/>
+        </w:rPr>
+        <w:t>2.7 基因互作与网络重排分析</w:t>
+      </w:r>
+    </w:p>
+    <w:p>
+      <w:pPr>
+        <w:spacing w:after="120" w:line="300" w:lineRule="auto"/>
+        <w:ind w:firstLine="440"/>
+        <w:jc w:val="both"/>
+      </w:pPr>
+      <w:r>
+        <w:rPr>
+          <w:rFonts w:ascii="Times New Roman" w:hAnsi="Times New Roman" w:eastAsia="宋体" w:cs="Times New Roman"/>
+          <w:b w:val="0"/>
+          <w:sz w:val="22"/>
+        </w:rPr>
+        <w:t>为考察基因互作关系是否能为图像化提供更贴近生物学的空间邻接，在 PAM50 交集样本上构建三类网络：mRNA 共表达网络、consensus-gene STRING PPI 网络，以及 miRNA–mRNA 负相关和 CNV–mRNA 相关网络。mRNA 共表达网络基于最终特征的 Pearson 相关，边阈值为 |r|≥0.75；PPI 使用 STRING 数据库的 high-confidence 边；跨组学相关使用 Spearman 相关并保留最强候选边。随后按共表达社区重排 mRNA 特征，生成与原始 JSD 螺旋排序相同的 20×20 灰度图，并用 FullSizeCNN 进行 5 折交叉验证比较。</w:t>
+      </w:r>
+    </w:p>
+    <w:p>
+      <w:pPr>
         <w:pStyle w:val="Heading1"/>
         <w:spacing w:before="320" w:after="140"/>
         <w:jc w:val="left"/>
@@ -4454,6 +4485,37 @@
     </w:p>
     <w:p>
       <w:pPr>
+        <w:pStyle w:val="Heading2"/>
+        <w:spacing w:before="240" w:after="100"/>
+        <w:jc w:val="left"/>
+      </w:pPr>
+      <w:r>
+        <w:rPr>
+          <w:rFonts w:ascii="Times New Roman" w:hAnsi="Times New Roman" w:eastAsia="微软雅黑" w:cs="Times New Roman"/>
+          <w:b/>
+          <w:color w:val="2E74B5"/>
+          <w:sz w:val="26"/>
+        </w:rPr>
+        <w:t>3.8 基因互作与网络重排分析</w:t>
+      </w:r>
+    </w:p>
+    <w:p>
+      <w:pPr>
+        <w:spacing w:after="120" w:line="300" w:lineRule="auto"/>
+        <w:ind w:firstLine="440"/>
+        <w:jc w:val="both"/>
+      </w:pPr>
+      <w:r>
+        <w:rPr>
+          <w:rFonts w:ascii="Times New Roman" w:hAnsi="Times New Roman" w:eastAsia="宋体" w:cs="Times New Roman"/>
+          <w:b w:val="0"/>
+          <w:sz w:val="22"/>
+        </w:rPr>
+        <w:t>mRNA consensus genes 的 STRING PPI 网络主要涉及 ESR1、PGR、MYBL2、BIRC5 和 E2F8，提示激素信号与细胞增殖/有丝分裂程序的耦合。mRNA 共表达网络在较高阈值下形成较稀疏的社区结构；miRNA–mRNA 与 CNV–mRNA 分析识别出若干候选跨组学调控边。按共表达社区重排 mRNA 图像后，FullSizeCNN 的 Accuracy 为 0.8931，低于原始 JSD 螺旋排序，说明生物邻接关系能够提供可解释性上下文，但当前未带来预测性能提升；完整网络文件与总览图见补充材料 S22、图 S17，社区重排对比见表 S30。</w:t>
+      </w:r>
+    </w:p>
+    <w:p>
+      <w:pPr>
         <w:pStyle w:val="Heading1"/>
         <w:spacing w:before="320" w:after="140"/>
         <w:jc w:val="left"/>

</xml_diff>

<commit_message>
Promote gene interaction overview to main figure
</commit_message>
<xml_diff>
--- a/docs/Supervised_distribution_divergence_guided_omics_imaging_manuscript_CN.docx
+++ b/docs/Supervised_distribution_divergence_guided_omics_imaging_manuscript_CN.docx
@@ -4516,6 +4516,61 @@
     </w:p>
     <w:p>
       <w:pPr>
+        <w:keepNext/>
+        <w:spacing w:before="100" w:after="20"/>
+        <w:jc w:val="center"/>
+      </w:pPr>
+      <w:r>
+        <w:drawing>
+          <wp:inline xmlns:a="http://schemas.openxmlformats.org/drawingml/2006/main" xmlns:pic="http://schemas.openxmlformats.org/drawingml/2006/picture">
+            <wp:extent cx="5852160" cy="4339112"/>
+            <wp:docPr id="10" name="Picture 10"/>
+            <wp:cNvGraphicFramePr>
+              <a:graphicFrameLocks noChangeAspect="1"/>
+            </wp:cNvGraphicFramePr>
+            <a:graphic>
+              <a:graphicData uri="http://schemas.openxmlformats.org/drawingml/2006/picture">
+                <pic:pic>
+                  <pic:nvPicPr>
+                    <pic:cNvPr id="0" name="fig_gene_interaction_overview.png"/>
+                    <pic:cNvPicPr/>
+                  </pic:nvPicPr>
+                  <pic:blipFill>
+                    <a:blip r:embed="rId19"/>
+                    <a:stretch>
+                      <a:fillRect/>
+                    </a:stretch>
+                  </pic:blipFill>
+                  <pic:spPr>
+                    <a:xfrm>
+                      <a:off x="0" y="0"/>
+                      <a:ext cx="5852160" cy="4339112"/>
+                    </a:xfrm>
+                    <a:prstGeom prst="rect"/>
+                  </pic:spPr>
+                </pic:pic>
+              </a:graphicData>
+            </a:graphic>
+          </wp:inline>
+        </w:drawing>
+      </w:r>
+    </w:p>
+    <w:p>
+      <w:pPr>
+        <w:spacing w:before="60" w:after="180"/>
+        <w:jc w:val="center"/>
+      </w:pPr>
+      <w:r>
+        <w:rPr>
+          <w:rFonts w:ascii="Times New Roman" w:hAnsi="Times New Roman" w:eastAsia="宋体" w:cs="Times New Roman"/>
+          <w:color w:val="555555"/>
+          <w:sz w:val="18"/>
+        </w:rPr>
+        <w:t>Figure 10. Gene interaction analysis overview. A: consensus-gene STRING PPI; B: mRNA co-expression communities; C: top miRNA-mRNA negative correlations; D: top CNV-mRNA correlations. The community-informed ordering is compared with the JSD spiral ordering in Supplementary Table S30.</w:t>
+      </w:r>
+    </w:p>
+    <w:p>
+      <w:pPr>
         <w:pStyle w:val="Heading1"/>
         <w:spacing w:before="320" w:after="140"/>
         <w:jc w:val="left"/>

</xml_diff>

<commit_message>
Update gene interaction overview figure
</commit_message>
<xml_diff>
--- a/docs/Supervised_distribution_divergence_guided_omics_imaging_manuscript_CN.docx
+++ b/docs/Supervised_distribution_divergence_guided_omics_imaging_manuscript_CN.docx
@@ -4523,7 +4523,7 @@
       <w:r>
         <w:drawing>
           <wp:inline xmlns:a="http://schemas.openxmlformats.org/drawingml/2006/main" xmlns:pic="http://schemas.openxmlformats.org/drawingml/2006/picture">
-            <wp:extent cx="5852160" cy="4339112"/>
+            <wp:extent cx="5852160" cy="4296022"/>
             <wp:docPr id="10" name="Picture 10"/>
             <wp:cNvGraphicFramePr>
               <a:graphicFrameLocks noChangeAspect="1"/>
@@ -4544,7 +4544,7 @@
                   <pic:spPr>
                     <a:xfrm>
                       <a:off x="0" y="0"/>
-                      <a:ext cx="5852160" cy="4339112"/>
+                      <a:ext cx="5852160" cy="4296022"/>
                     </a:xfrm>
                     <a:prstGeom prst="rect"/>
                   </pic:spPr>

</xml_diff>

<commit_message>
Address reviewer comments on terminology and robustness interpretation
</commit_message>
<xml_diff>
--- a/docs/Supervised_distribution_divergence_guided_omics_imaging_manuscript_CN.docx
+++ b/docs/Supervised_distribution_divergence_guided_omics_imaging_manuscript_CN.docx
@@ -105,7 +105,7 @@
           <w:b w:val="0"/>
           <w:sz w:val="21"/>
         </w:rPr>
-        <w:t>结果：在单组学 PAM50 四分类的探索性 5 折交叉验证中，mRNA LogisticRegression 的 Accuracy 为 0.9628±0.0167、Macro-F1 为 0.9575±0.0199；CNV 最优 MLP 为 0.7213±0.0156；miRNA 最优 LogisticRegression 为 0.8410±0.0120。无泄漏 nested repeated CV 中，mRNA PAM50 的 LogisticRegression、Dense 和 FullSizeCNN Accuracy 分别为 0.8392、0.8449 和 0.8510，说明性能对特征筛选与建模流程敏感。生存风险建模中，mRNA FullSizeCNN 的 C-index 为 0.7125±0.0303，CNV CoxPH 为 0.7109±0.0339，miRNA FullSizeCNN 为 0.6067±0.0703。多组学整合中，PAM50 的 Transformer 达到 Accuracy 0.9270±0.0132、Macro-F1 0.9288±0.0128；生存风险建模的三组学 Concat MLP 达到 C-index 0.7588±0.0492，CNN 晚期平均融合达到 ROC AUC 0.7591±0.0619。配对检验未提供存在统计可检测差异的证据（所有 p≥0.093）。Dense-equivalent controls performed comparably to or better than FullSizeCNN, while JSD-guided spiral ordering did not significantly outperform random permutations, indicating that the principal value of imaging was interpretability rather than predictive gain。可解释分析识别出 ESR1、TFF1、AGR3、FOXC1、MIA、FABP7、CCL19、MS4A1 等关键因子，富集于雌激素信号、细胞增殖调控、细胞分裂和上皮发育等通路。方案2功能类别遮盖分析在控制特征集合大小后，未能建立稳健的类别特异效应。</w:t>
+        <w:t>结果：在单组学 PAM50 四分类的探索性 5 折交叉验证中，mRNA LogisticRegression 的 Accuracy 为 0.9628±0.0167、Macro-F1 为 0.9575±0.0199；CNV 最优 MLP 为 0.7213±0.0156；miRNA 最优 LogisticRegression 为 0.8410±0.0120。无泄漏 nested repeated CV 中，mRNA PAM50 的 LogisticRegression、Dense 和 FullSizeCNN Accuracy 分别为 0.8392、0.8449 和 0.8510，说明性能对特征筛选与建模流程敏感。生存风险建模中，mRNA FullSizeCNN 的 C-index 为 0.7125±0.0303，CNV CoxPH 为 0.7109±0.0339，miRNA FullSizeCNN 为 0.6067±0.0703。多组学整合中，PAM50 的 Transformer 达到 Accuracy 0.9270±0.0132、Macro-F1 0.9288±0.0128；生存风险建模的三组学 Concat MLP 达到 C-index 0.7588±0.0492，CNN 晚期平均融合达到 ROC AUC 0.7591±0.0619。配对检验未提供存在统计可检测差异的证据（所有 p≥0.093）。Dense-equivalent controls performed comparably to or better than FullSizeCNN, while JSD-guided spiral ordering did not significantly outperform random permutations, indicating that the principal value of imaging was interpretability rather than predictive gain. 可解释分析识别出 ESR1、TFF1、AGR3、FOXC1、MIA、FABP7、CCL19、MS4A1 等关键因子，富集于雌激素信号、细胞增殖调控、细胞分裂和上皮发育等通路。方案2功能类别遮盖分析在控制特征集合大小后，未能建立稳健的类别特异效应。</w:t>
       </w:r>
     </w:p>
     <w:p>
@@ -135,7 +135,7 @@
           <w:b w:val="0"/>
           <w:sz w:val="21"/>
         </w:rPr>
-        <w:t>关键词：乳腺癌；多组学；组学图像化；Jensen–Shannon divergence；全尺寸卷积；PAM50；生存预测</w:t>
+        <w:t>关键词：乳腺癌；多组学；组学图像化；Jensen–Shannon divergence；全尺寸卷积；PAM50；生存风险建模</w:t>
       </w:r>
     </w:p>
     <w:p>
@@ -331,7 +331,7 @@
           <w:b w:val="0"/>
           <w:sz w:val="22"/>
         </w:rPr>
-        <w:t>本文的贡献包括：提出 JSD 引导的中心-螺旋组学图像化框架；系统比较传统机器学习、MLP、FullSizeCNN 及多种多组学融合策略；在严格 5 折交叉验证下报告均值和标准差；利用 SHAP、CNN saliency 和基因功能类别图开展关键因子可视化；并通过方案2功能类别遮盖实验与等量随机遮盖对照，评估不同功能模块对 PAM50 分类和生存预测的贡献。</w:t>
+        <w:t>本文的贡献包括：提出 JSD 引导的中心-螺旋组学图像化框架；系统比较传统机器学习、MLP、FullSizeCNN 及多种多组学融合策略；在严格 5 折交叉验证下报告均值和标准差；利用 SHAP、CNN saliency 和基因功能类别图开展关键因子可视化；并通过方案2功能类别遮盖实验与等量随机遮盖对照，评估不同功能模块对 PAM50 分类和生存风险建模的贡献。</w:t>
       </w:r>
     </w:p>
     <w:p>
@@ -1078,7 +1078,7 @@
           <w:b w:val="0"/>
           <w:sz w:val="22"/>
         </w:rPr>
-        <w:t>需要明确，除 CoxPH 与 DeepSurv 属于时间到事件模型外，其余模型（LogisticRegression、SVC、RandomForest、MLP、FullSizeCNN 等）以二元交叉熵拟合 OS 事件，本质上是死亡状态分类（mortality-status classification）；其输出被作为连续风险分数，再结合生存时间计算 C-index 进行生存排序评估（survival-ranking evaluation），因此本文所称“生存预测”并不等同于严格的风险率建模。</w:t>
+        <w:t>需要明确，除 CoxPH 与 DeepSurv 属于时间到事件模型外，其余模型（LogisticRegression、SVC、RandomForest、MLP、FullSizeCNN 等）以二元交叉熵拟合 OS 事件，本质上是死亡状态分类（mortality-status classification）；其输出被作为连续风险分数，再结合生存时间计算 C-index 进行生存排序评估（survival-ranking evaluation），因此本文所称“生存风险建模”并不等同于严格的风险率建模。</w:t>
       </w:r>
     </w:p>
     <w:p>
@@ -2543,7 +2543,7 @@
           <w:b w:val="0"/>
           <w:sz w:val="22"/>
         </w:rPr>
-        <w:t>传统机器学习基线包括 LogisticRegression、RandomForest、GradientBoosting、线性 SVC、KNN 和 MLP；生存预测另纳入 CoxPH。LogisticRegression 使用 L2 默认正则并增加最大迭代；RandomForest 使用 200 棵树；GradientBoosting 使用 100 轮；SVC 使用线性核；KNN 使用 k=5；MLP 采用 128-64 隐层和 Dropout。CoxPH 采用 top-100 方差特征和 0.1 惩罚。</w:t>
+        <w:t>传统机器学习基线包括 LogisticRegression、RandomForest、GradientBoosting、线性 SVC、KNN 和 MLP；生存风险建模另纳入 CoxPH。LogisticRegression 使用 L2 默认正则并增加最大迭代；RandomForest 使用 200 棵树；GradientBoosting 使用 100 轮；SVC 使用线性核；KNN 使用 k=5；MLP 采用 128-64 隐层和 Dropout。CoxPH 作为传统时间到事件比较模型，使用单独定义的 top-100 方差特征和 0.1 惩罚。</w:t>
       </w:r>
     </w:p>
     <w:p>
@@ -2558,7 +2558,7 @@
           <w:b w:val="0"/>
           <w:sz w:val="22"/>
         </w:rPr>
-        <w:t>MLP 与 FullSizeCNN 均使用 Adam 优化器，学习率 1×10⁻³、权重衰减 1×10⁻⁴，训练 30 个 epoch，批大小为 64。PAM50 使用交叉熵损失，输出四类概率；生存预测使用二元交叉熵损失，输出死亡风险概率。训练前仅在训练折上估计 StandardScaler 参数，测试折使用同一 scaler 变换。</w:t>
+        <w:t>MLP 与 FullSizeCNN 均使用 Adam 优化器，学习率 1×10⁻³、权重衰减 1×10⁻⁴，训练 30 个 epoch，批大小为 64。PAM50 使用交叉熵损失，输出四类概率；生存风险建模使用二元交叉熵损失，输出死亡风险概率。训练前仅在训练折上估计 StandardScaler 参数，测试折使用同一 scaler 变换。</w:t>
       </w:r>
     </w:p>
     <w:p>
@@ -2766,7 +2766,7 @@
           <w:color w:val="555555"/>
           <w:sz w:val="18"/>
         </w:rPr>
-        <w:t>说明：所有表格与图中结果均为“基于训练折内筛选特征的结果”，在 5 折交叉验证下给出均值±标准差。PAM50 四分类报告 Accuracy 和 Macro-F1；生存预测报告 ROC AUC 和 Cox C-index。ROC AUC 以模型输出的死亡风险概率/风险分数作为连续预测分数计算；C-index 使用取负后的风险分数、生存时间与事件状态，通过 lifelines.utils.concordance_index 计算，风险分数越大代表死亡风险越高。</w:t>
+        <w:t>说明：所有表格与图中结果均为“基于训练折内筛选特征的结果”，在 5 折交叉验证下给出均值±标准差。PAM50 四分类报告 Accuracy 和 Macro-F1；生存风险建模报告 ROC AUC 和 Cox C-index。ROC AUC 以模型输出的死亡风险概率/风险分数作为连续预测分数计算；C-index 使用取负后的风险分数、生存时间与事件状态，通过 lifelines.utils.concordance_index 计算，风险分数越大代表死亡风险越高。</w:t>
       </w:r>
     </w:p>
     <w:p>
@@ -2797,7 +2797,7 @@
           <w:b w:val="0"/>
           <w:sz w:val="22"/>
         </w:rPr>
-        <w:t>为考察基因互作关系是否能为图像化提供更贴近生物学的空间邻接，在 PAM50 交集样本上构建三类网络：mRNA 共表达网络、consensus-gene STRING PPI 网络，以及 miRNA–mRNA 负相关和 CNV–mRNA 相关网络。mRNA 共表达网络基于最终特征的 Pearson 相关，边阈值为 |r|≥0.75；PPI 使用 STRING 数据库的 high-confidence 边；跨组学相关使用 Spearman 相关并保留最强候选边。随后按共表达社区重排 mRNA 特征，生成与原始 JSD 螺旋排序相同的 20×20 灰度图，并用 FullSizeCNN 进行 5 折交叉验证比较。</w:t>
+        <w:t>为考察基因互作关系是否能为图像化提供更贴近生物学的空间邻接，在 PAM50 交集样本上构建三类网络：mRNA 共表达网络、consensus-gene STRING PPI 网络，以及 miRNA–mRNA 负相关和 CNV–mRNA 相关网络。mRNA 共表达网络基于最终特征的 Pearson 相关，边阈值为 |r|≥0.75；该阈值较保守，因此网络社区较稀疏，结果应作为高置信边描述而非最终生物学模块定义。PPI 使用 STRING 数据库的 high-confidence 边；跨组学相关使用 Spearman 相关并保留最强候选边。随后按共表达社区重排 mRNA 特征，生成与原始 JSD 螺旋排序相同的 20×20 灰度图，并用 FullSizeCNN 进行 5 折交叉验证比较。</w:t>
       </w:r>
     </w:p>
     <w:p>
@@ -2960,7 +2960,7 @@
           <w:b w:val="0"/>
           <w:sz w:val="22"/>
         </w:rPr>
-        <w:t>单组学结果显示，mRNA 对 PAM50 的判别能力最强，miRNA 次之，CNV 最弱；生存预测中 mRNA 与 CNV 的 C-index 接近，miRNA 较弱。各任务、各指标下的最优模型及其 5 折交叉验证 mean±SD 见表 3，完整模型比较见图 4 与补充表 S4。</w:t>
+        <w:t>单组学结果显示，mRNA 对 PAM50 的判别能力最强，miRNA 次之，CNV 最弱；生存风险建模中 mRNA 与 CNV 的 C-index 接近，miRNA 较弱。各任务、各指标下的最优模型及其 5 折交叉验证 mean±SD 见表 3，完整模型比较见图 4 与补充表 S4。</w:t>
       </w:r>
     </w:p>
     <w:p>
@@ -3991,7 +3991,7 @@
           <w:b w:val="0"/>
           <w:sz w:val="22"/>
         </w:rPr>
-        <w:t>生存预测中，CNN 晚期平均融合的 ROC AUC 为 0.7591±0.0619，三组学 Concat MLP 的 C-index 为 0.7588±0.0492；两者分别高于交集最优单组学 mRNA MLP（ROC AUC 0.7258±0.0690）和 mRNA FullSizeCNN（C-index 0.7448±0.0705），但统计检验显示提升未达到显著水平（补充表 S10）。</w:t>
+        <w:t>生存风险建模中，CNN 晚期平均融合的 ROC AUC 为 0.7591±0.0619，三组学 Concat MLP 的 C-index 为 0.7588±0.0492；两者分别高于交集最优单组学 mRNA MLP（ROC AUC 0.7258±0.0690）和 mRNA FullSizeCNN（C-index 0.7448±0.0705），但统计检验显示提升未达到显著水平（补充表 S10）。在相同图像 backbone 下使用 Cox partial-likelihood 的 FullSizeCNN-Cox 得到 C-index 0.6818±0.0401，低于 BCE-based FullSizeCNN，进一步说明当前图像表示在严格时间到事件建模下未显示明确优势。</w:t>
       </w:r>
     </w:p>
     <w:p>
@@ -4077,7 +4077,7 @@
           <w:b w:val="0"/>
           <w:sz w:val="22"/>
         </w:rPr>
-        <w:t>两两组学中，PAM50 的 mRNA+CNV LogisticRegression 达到 Accuracy 0.9633±0.0039；mRNA+miRNA LogisticRegression 为 0.9095；CNV+miRNA LogisticRegression 为 0.8438。生存预测中，mRNA+CNV Concat MLP 的 C-index 为 0.7451，mRNA+miRNA Concat MLP 为 0.7337，CNV+miRNA CNN LateAvg 为 0.7216。9 模型 Stacking 的 PAM50 Accuracy 为 0.9229，生存 C-index 为 0.7321、ROC AUC 为 0.7469，未稳定超过最优简单融合。</w:t>
+        <w:t>两两组学中，PAM50 的 mRNA+CNV LogisticRegression 达到 Accuracy 0.9633±0.0039；mRNA+miRNA LogisticRegression 为 0.9095；CNV+miRNA LogisticRegression 为 0.8438。生存风险建模中，mRNA+CNV Concat MLP 的 C-index 为 0.7451，mRNA+miRNA Concat MLP 为 0.7337，CNV+miRNA CNN LateAvg 为 0.7216。9 模型 Stacking 的 PAM50 Accuracy 为 0.9229，生存 C-index 为 0.7321、ROC AUC 为 0.7469，未稳定超过最优简单融合。</w:t>
       </w:r>
     </w:p>
     <w:p>
@@ -4511,7 +4511,7 @@
           <w:b w:val="0"/>
           <w:sz w:val="22"/>
         </w:rPr>
-        <w:t>mRNA consensus genes 的 STRING PPI 网络主要涉及 ESR1、PGR、MYBL2、BIRC5 和 E2F8，提示激素信号与细胞增殖/有丝分裂程序的耦合。mRNA 共表达网络在较高阈值下形成较稀疏的社区结构；miRNA–mRNA 与 CNV–mRNA 分析识别出若干候选跨组学调控边。按共表达社区重排 mRNA 图像后，FullSizeCNN 的 Accuracy 为 0.8931，低于原始 JSD 螺旋排序，说明生物邻接关系能够提供可解释性上下文，但当前未带来预测性能提升；完整网络文件与总览图见补充材料 S22、图 S17，社区重排对比见表 S30。</w:t>
+        <w:t>mRNA consensus genes 的 STRING PPI 网络主要涉及 ESR1、PGR、MYBL2、BIRC5 和 E2F8，提示激素信号与细胞增殖/有丝分裂程序的耦合；由于仅保留高置信边，PPI 结果应视为探索性证据。mRNA 共表达网络在较高阈值下形成较稀疏的社区结构；miRNA–mRNA 与 CNV–mRNA 分析识别出若干候选跨组学调控边。按共表达社区重排 mRNA 图像后，FullSizeCNN 的 Accuracy 为 0.8931，低于原始 JSD 螺旋排序，说明生物邻接关系能够提供可解释性上下文，但当前未带来预测性能提升；完整网络文件与总览图见补充材料 S22、图 S17，社区重排对比见表 S30。</w:t>
       </w:r>
     </w:p>
     <w:p>
@@ -4597,7 +4597,7 @@
           <w:b w:val="0"/>
           <w:sz w:val="22"/>
         </w:rPr>
-        <w:t>在本数据集中，mRNA 是 PAM50 分型的主要信号源，其 LogisticRegression 和 SVC 已接近高精度，而 FullSizeCNN 在小样本下也达到 0.93 以上 Accuracy。CNV 单独预测能力有限，但在生存预测中 CoxPH 和 LogisticRegression 的 C-index 与 mRNA 接近，提示拷贝数变异可能携带与长期结局相关的补充信息。miRNA 的样本量较小，单组学性能较低。</w:t>
+        <w:t>在本数据集中，mRNA 是 PAM50 分型的主要信号源，其 LogisticRegression 和 SVC 已接近高精度，而 FullSizeCNN 在小样本下也达到 0.93 以上 Accuracy。CNV 单独预测能力有限，但在生存风险建模中 CoxPH 和 LogisticRegression 的 C-index 与 mRNA 接近，提示拷贝数变异可能携带与长期结局相关的补充信息。miRNA 的样本量较小，单组学性能较低。</w:t>
       </w:r>
     </w:p>
     <w:p>
@@ -4627,7 +4627,7 @@
           <w:b w:val="0"/>
           <w:sz w:val="22"/>
         </w:rPr>
-        <w:t>多组学融合对 PAM50 的增益有限，主要原因是 mRNA 已具有强判别能力，其他组学在高维小样本条件下容易引入噪声。生存任务中，简单拼接 MLP 和 CNN 晚期平均融合的均值优于单组学，说明多组学在生存风险预测中的互补性更强；但配对 t 检验与 Wilcoxon 检验均未达到 0.05 显著性水平（ROC AUC 的配对 t 检验 p=0.093），提示当前样本量不足以稳定区分融合策略。</w:t>
+        <w:t>多组学融合对 PAM50 的增益有限，主要原因是 mRNA 已具有强判别能力，其他组学在高维小样本条件下容易引入噪声。生存风险建模中，简单拼接 MLP 和 CNN 晚期平均融合的均值优于单组学，说明多组学在生存风险建模中的互补性更强；但配对 t 检验与 Wilcoxon 检验均未达到 0.05 显著性水平（ROC AUC 的配对 t 检验 p=0.093），提示当前样本量不足以稳定区分融合策略。</w:t>
       </w:r>
     </w:p>
     <w:p>
@@ -4657,7 +4657,7 @@
           <w:b w:val="0"/>
           <w:sz w:val="22"/>
         </w:rPr>
-        <w:t>为进一步检验二维空间结构本身是否带来额外增益，本研究训练了与 FullSizeCNN 参数量一致的 Dense 等价基线（Flatten→Dense(32)→Dense(64)→输出，首层参数量与全尺寸卷积核完全相同）。结果显示，该 Dense 基线在 PAM50 上整体优于或持平 FullSizeCNN（mRNA Accuracy 0.9568±0.0184 对 0.9316±0.0071；CNV 0.7238 对 0.7164；miRNA 0.8370 对 0.8230），而生存预测中两者互有高低且差异未超过交叉验证标准差（mRNA C-index 0.6802 对 0.7125）。因此，本数据中的判别信息主要来自原始特征数值本身，而非人为构造的二维邻接结构；FullSizeCNN 图像化的价值在于把特征重要性、功能类别和模型注意力统一到同一像素坐标系，从而支撑可解释分析，而非提升预测精度。</w:t>
+        <w:t>为进一步检验二维空间结构本身是否带来额外增益，本研究训练了与 FullSizeCNN 参数量一致的 Dense 等价基线（Flatten→Dense(32)→Dense(64)→输出，首层参数量与全尺寸卷积核完全相同）。结果显示，该 Dense 基线在 PAM50 上整体优于或持平 FullSizeCNN（mRNA Accuracy 0.9568±0.0184 对 0.9316±0.0071；CNV 0.7238 对 0.7164；miRNA 0.8370 对 0.8230），而生存风险建模中两者互有高低且差异未超过交叉验证标准差（mRNA C-index 0.6802 对 0.7125）。因此，本数据中的判别信息主要来自原始特征数值本身，而非人为构造的二维邻接结构；FullSizeCNN 图像化的价值在于把特征重要性、功能类别和模型注意力统一到同一像素坐标系，从而支撑可解释分析，而非提升预测精度。</w:t>
       </w:r>
     </w:p>
     <w:p>
@@ -4672,7 +4672,7 @@
           <w:b w:val="0"/>
           <w:sz w:val="22"/>
         </w:rPr>
-        <w:t>作为对排序假设的直接检验，本研究在 mRNA 上对 JSD 螺旋排序与 20 次随机基因排列进行了对照。结果表明，JSD 螺旋排序并未优于随机排列：PAM50 Accuracy 的 JSD 结果为 0.9316，而 20 次随机排列的均值为 0.9267（范围 0.9112–0.9400，经验 p=0.25）；Survival C-index 的 JSD 结果为 0.7125，随机排列均值为 0.7055（经验 p=0.35）。均值表达排序在 PAM50 Accuracy 上与 JSD 完全一致（0.9316），进一步说明二维像素位置本身几乎不携带预测信息。据此，本文将组学图像化明确限定为一种“可解释的空间表示”，而不是能提升分类或生存预测精度的排序方法。</w:t>
+        <w:t>作为对排序假设的直接检验，本研究在 mRNA 上对 JSD 螺旋排序与 20 次随机基因排列进行了对照。结果表明，JSD 螺旋排序并未优于随机排列：PAM50 Accuracy 的 JSD 结果为 0.9316，而 20 次随机排列的均值为 0.9267（范围 0.9112–0.9400，经验 p=0.25）；Survival C-index 的 JSD 结果为 0.7125，随机排列均值为 0.7055（经验 p=0.35）。均值表达排序在 PAM50 Accuracy 上与 JSD 完全一致（0.9316），进一步说明二维像素位置本身几乎不携带预测信息。据此，本文将组学图像化明确限定为一种“可解释的空间表示”，而不是能提升分类或生存风险排序精度的排序方法。</w:t>
       </w:r>
     </w:p>
     <w:p>
@@ -4687,7 +4687,7 @@
           <w:b w:val="0"/>
           <w:sz w:val="22"/>
         </w:rPr>
-        <w:t>为控制特征数量选择与最终评估共用同一交叉验证可能带来的选择偏倚，本研究进一步在 mRNA PAM50 上进行了无泄漏嵌套交叉验证：外层 5-fold × 5 repeats，内层 3-fold 选择特征数（200/400），特征筛选采用 V_L1，并在所选特征上按 JSD 排序生成 FullSizeCNN 图像。结果显示，LogisticRegression 的 Accuracy 为 0.8392±0.0288，FullSizeCNN 为 0.8510±0.0282，Dense 等价基线为 0.8449±0.0326；三者均低于正文基于最终 400 特征的结果，且 FullSizeCNN 与 Dense 的差异未超过交叉验证标准差。这再次表明，二维空间布局本身并未提供稳定的预测增益，正文结果应理解为基于训练折内预选特征的 exploratory CV estimate；完整结果见补充材料表 S24–S26。</w:t>
+        <w:t>为控制特征数量选择与最终评估共用同一交叉验证可能带来的选择偏倚，本研究进一步在 mRNA PAM50 上进行了无泄漏嵌套交叉验证：外层 5-fold × 5 repeats，内层 3-fold 选择特征数（200/400），特征筛选采用 V_L1，并在所选特征上按 JSD 排序生成 FullSizeCNN 图像。结果显示，LogisticRegression 的 Accuracy 为 0.8392±0.0288，FullSizeCNN 为 0.8510±0.0282，Dense 等价基线为 0.8449±0.0326；三者均低于正文基于最终 400 特征的结果，且 FullSizeCNN 与 Dense 的差异未超过交叉验证标准差。该差异可能同时来自特征数选择和特征筛选流程的改变，而非单一的选择偏倚，因此不能把 0.9628 与 0.8392 的落差完全归因于原主结果的乐观偏差。这再次表明，二维空间布局本身并未提供稳定的预测增益，正文结果应理解为基于训练折内预选特征的 exploratory CV estimate；完整结果见补充材料表 S24–S26。</w:t>
       </w:r>
     </w:p>
     <w:p>
@@ -5553,7 +5553,7 @@
           <w:b w:val="0"/>
           <w:sz w:val="22"/>
         </w:rPr>
-        <w:t>[51] Li Q, Liu L, Zhang Q, Zhang X, Li N, Zhao Y, et al. MoACNN-XGNet: interpretable multi-omics convolutional network for breast cancer subtyping and prognostic genes identification. IEEE J Biomed Health Inform. 2025. doi:10.1109/JBHI.2025.3595381.</w:t>
+        <w:t>[51] Li Q, Liu L, Zhang Q, Zhang X, Li N, Zhao Y, et al. MoACNN-XGNet: interpretable multi-omics convolutional network for breast cancer subtyping and prognostic genes identification. IEEE J Biomed Health Inform. 2025. Early access. doi:10.1109/JBHI.2025.3595381.</w:t>
       </w:r>
     </w:p>
     <w:p>

</xml_diff>

<commit_message>
Replace Figure 2 with multi-omics FullSizeCNN diagram and align methods/caption
</commit_message>
<xml_diff>
--- a/docs/Supervised_distribution_divergence_guided_omics_imaging_manuscript_CN.docx
+++ b/docs/Supervised_distribution_divergence_guided_omics_imaging_manuscript_CN.docx
@@ -2573,7 +2573,7 @@
           <w:b w:val="0"/>
           <w:sz w:val="22"/>
         </w:rPr>
-        <w:t>FullSizeCNN 的输入为 H×W×1 图像，第一层使用与 H×W 相同的全尺寸卷积核，输出 32 个 1×1 特征图；随后展平为 32 维向量，经 64 维全连接、ReLU 和 Dropout 后输出分类 logits 或生存风险。结构如图 2 所示。需要指出，该全尺寸卷积核在数学上等价于展平后的全连接投影，因此本文将其视为保留图像坐标接口的 full-field convolutional network，而不是滑动/局部卷积特征提取器；其图像接口主要用于后续归因可视化，而非依赖二维局部感受野获得预测增益。</w:t>
+        <w:t>FullSizeCNN 的输入为 H×W×1 图像，第一层使用与 H×W 相同的全尺寸卷积核，输出 32 个 1×1 特征图；随后展平为 32 维向量。单组学任务直接经 64 维全连接、ReLU 和 Dropout 后输出分类 logits 或生存风险。多组学整合时，三个组学各自的 32 维描述子先拼接为 96 维，再经门控注意力按 softmax 权重加权求和为 32 维，最后经 32→64 全连接后输出；也可采用概率晚期平均融合。结构如图 2 所示。需要指出，该全尺寸卷积核在数学上等价于展平后的全连接投影，因此本文将其视为保留图像坐标接口的 full-field convolutional network，而不是滑动/局部卷积特征提取器；其图像接口主要用于后续归因可视化，而非依赖二维局部感受野获得预测增益。</w:t>
       </w:r>
     </w:p>
     <w:p>
@@ -2585,7 +2585,7 @@
       <w:r>
         <w:drawing>
           <wp:inline xmlns:a="http://schemas.openxmlformats.org/drawingml/2006/main" xmlns:pic="http://schemas.openxmlformats.org/drawingml/2006/picture">
-            <wp:extent cx="5669280" cy="2106206"/>
+            <wp:extent cx="5852160" cy="2300078"/>
             <wp:docPr id="2" name="Picture 2"/>
             <wp:cNvGraphicFramePr>
               <a:graphicFrameLocks noChangeAspect="1"/>
@@ -2594,7 +2594,7 @@
               <a:graphicData uri="http://schemas.openxmlformats.org/drawingml/2006/picture">
                 <pic:pic>
                   <pic:nvPicPr>
-                    <pic:cNvPr id="0" name="fig2_fullsize_cnn_v4.png"/>
+                    <pic:cNvPr id="0" name="fig2_2d_detail.png"/>
                     <pic:cNvPicPr/>
                   </pic:nvPicPr>
                   <pic:blipFill>
@@ -2606,7 +2606,7 @@
                   <pic:spPr>
                     <a:xfrm>
                       <a:off x="0" y="0"/>
-                      <a:ext cx="5669280" cy="2106206"/>
+                      <a:ext cx="5852160" cy="2300078"/>
                     </a:xfrm>
                     <a:prstGeom prst="rect"/>
                   </pic:spPr>
@@ -2628,7 +2628,7 @@
           <w:color w:val="555555"/>
           <w:sz w:val="18"/>
         </w:rPr>
-        <w:t>Figure 2. FullSizeCNN architecture. An H×W×1 JSD image is transformed by a full-size convolutional layer with H×W kernels and 32 filters, flattened to 32 features, and passed through a 64-unit ReLU/Dropout MLP head. PAM50 uses H=W=20 and four output units; survival uses H=W=15 and one risk output.</w:t>
+        <w:t>Figure 2. Omics image representation and the multi-omics FullSizeCNN. Three JSD-ordered grayscale maps (mRNA 20×20, CNV 8×8, miRNA 25×25) are each processed by a full-size H×W convolution with 32 filters into 32 global descriptors. The three descriptors are concatenated (96), reweighted by a softmax gated attention (32), and passed through a 32→64 MLP head, which feeds a four-class PAM50 head and a survival-risk head. Survival uses image sizes 15×15 / 13×13 / 25×25. High-JSD features are placed centrally; the full-size kernel is mathematically equivalent to a flattened linear projection and mainly serves the interpretability interface.</w:t>
       </w:r>
     </w:p>
     <w:p>

</xml_diff>

<commit_message>
Center and tighten Figure 2 layout
</commit_message>
<xml_diff>
--- a/docs/Supervised_distribution_divergence_guided_omics_imaging_manuscript_CN.docx
+++ b/docs/Supervised_distribution_divergence_guided_omics_imaging_manuscript_CN.docx
@@ -2585,7 +2585,7 @@
       <w:r>
         <w:drawing>
           <wp:inline xmlns:a="http://schemas.openxmlformats.org/drawingml/2006/main" xmlns:pic="http://schemas.openxmlformats.org/drawingml/2006/picture">
-            <wp:extent cx="5852160" cy="2300078"/>
+            <wp:extent cx="5852160" cy="2027995"/>
             <wp:docPr id="2" name="Picture 2"/>
             <wp:cNvGraphicFramePr>
               <a:graphicFrameLocks noChangeAspect="1"/>
@@ -2606,7 +2606,7 @@
                   <pic:spPr>
                     <a:xfrm>
                       <a:off x="0" y="0"/>
-                      <a:ext cx="5852160" cy="2300078"/>
+                      <a:ext cx="5852160" cy="2027995"/>
                     </a:xfrm>
                     <a:prstGeom prst="rect"/>
                   </pic:spPr>

</xml_diff>

<commit_message>
Fix Figure 2 bottom clipping
</commit_message>
<xml_diff>
--- a/docs/Supervised_distribution_divergence_guided_omics_imaging_manuscript_CN.docx
+++ b/docs/Supervised_distribution_divergence_guided_omics_imaging_manuscript_CN.docx
@@ -2585,7 +2585,7 @@
       <w:r>
         <w:drawing>
           <wp:inline xmlns:a="http://schemas.openxmlformats.org/drawingml/2006/main" xmlns:pic="http://schemas.openxmlformats.org/drawingml/2006/picture">
-            <wp:extent cx="5852160" cy="2027995"/>
+            <wp:extent cx="5852160" cy="2080768"/>
             <wp:docPr id="2" name="Picture 2"/>
             <wp:cNvGraphicFramePr>
               <a:graphicFrameLocks noChangeAspect="1"/>
@@ -2606,7 +2606,7 @@
                   <pic:spPr>
                     <a:xfrm>
                       <a:off x="0" y="0"/>
-                      <a:ext cx="5852160" cy="2027995"/>
+                      <a:ext cx="5852160" cy="2080768"/>
                     </a:xfrm>
                     <a:prstGeom prst="rect"/>
                   </pic:spPr>

</xml_diff>

<commit_message>
Adopt heatmap/dumbbell plots for Figures 4-6 and 9
</commit_message>
<xml_diff>
--- a/docs/Supervised_distribution_divergence_guided_omics_imaging_manuscript_CN.docx
+++ b/docs/Supervised_distribution_divergence_guided_omics_imaging_manuscript_CN.docx
@@ -2945,7 +2945,7 @@
           <w:b w:val="0"/>
           <w:sz w:val="22"/>
         </w:rPr>
-        <w:t>Table 3 summarizes the overall best model for each task on full samples; Figure 4 shows all compared models with mean±SD. Full single-omics results are in Supplementary Table S4, and intersection single-omics baselines in Supplementary Table S5.</w:t>
+        <w:t>Table 3 summarizes the overall best model for each task on full samples; Figure 4 shows all compared models as a heatmap. Full single-omics results are in Supplementary Table S4, and intersection single-omics baselines in Supplementary Table S5.</w:t>
       </w:r>
     </w:p>
     <w:p>
@@ -3887,7 +3887,7 @@
       <w:r>
         <w:drawing>
           <wp:inline xmlns:a="http://schemas.openxmlformats.org/drawingml/2006/main" xmlns:pic="http://schemas.openxmlformats.org/drawingml/2006/picture">
-            <wp:extent cx="5852160" cy="3365333"/>
+            <wp:extent cx="5852160" cy="4352029"/>
             <wp:docPr id="4" name="Picture 4"/>
             <wp:cNvGraphicFramePr>
               <a:graphicFrameLocks noChangeAspect="1"/>
@@ -3896,7 +3896,7 @@
               <a:graphicData uri="http://schemas.openxmlformats.org/drawingml/2006/picture">
                 <pic:pic>
                   <pic:nvPicPr>
-                    <pic:cNvPr id="0" name="fig3_single_omics_v3.png"/>
+                    <pic:cNvPr id="0" name="fig4_single_omics_heatmap.png"/>
                     <pic:cNvPicPr/>
                   </pic:nvPicPr>
                   <pic:blipFill>
@@ -3908,7 +3908,7 @@
                   <pic:spPr>
                     <a:xfrm>
                       <a:off x="0" y="0"/>
-                      <a:ext cx="5852160" cy="3365333"/>
+                      <a:ext cx="5852160" cy="4352029"/>
                     </a:xfrm>
                     <a:prstGeom prst="rect"/>
                   </pic:spPr>
@@ -3930,7 +3930,7 @@
           <w:color w:val="555555"/>
           <w:sz w:val="18"/>
         </w:rPr>
-        <w:t>Figure 4. Single-omics prediction on full samples. A and B: PAM50 Accuracy and Macro-F1; C and D: survival ROC AUC and C-index. Bars show 5-fold cross-validation mean±SD with features selected within each training fold. PAM50 sample sizes: mRNA 833, CNV 818, miRNA 497; survival: mRNA 1073, CNV 1057, miRNA 739.</w:t>
+        <w:t>Figure 4. Single-omics prediction on full samples. Heatmaps show model performance for PAM50 Accuracy and Macro-F1 (A, B) and survival ROC AUC and C-index (C, D); rows are models and columns are omics (mRNA, CNV, miRNA). Values are 5-fold cross-validation means with features selected within each training fold. PAM50 sample sizes: mRNA 833, CNV 818, miRNA 497; survival: mRNA 1073, CNV 1057, miRNA 739.</w:t>
       </w:r>
     </w:p>
     <w:p>
@@ -3961,7 +3961,7 @@
           <w:b w:val="0"/>
           <w:sz w:val="22"/>
         </w:rPr>
-        <w:t>Figure 5 shows the triple-omics fusion methods; full fusion results are in Supplementary Table S6, and the best fusion versus the corresponding best single-omics comparison is summarized in Supplementary Table S10.</w:t>
+        <w:t>Figure 5 compares each triple-omics fusion scheme with the best single-omics baseline; full fusion results are in Supplementary Table S6, and the best fusion versus the corresponding best single-omics comparison is summarized in Supplementary Table S10.</w:t>
       </w:r>
     </w:p>
     <w:p>
@@ -4003,7 +4003,7 @@
       <w:r>
         <w:drawing>
           <wp:inline xmlns:a="http://schemas.openxmlformats.org/drawingml/2006/main" xmlns:pic="http://schemas.openxmlformats.org/drawingml/2006/picture">
-            <wp:extent cx="5852160" cy="3587313"/>
+            <wp:extent cx="5852160" cy="3867705"/>
             <wp:docPr id="5" name="Picture 5"/>
             <wp:cNvGraphicFramePr>
               <a:graphicFrameLocks noChangeAspect="1"/>
@@ -4012,7 +4012,7 @@
               <a:graphicData uri="http://schemas.openxmlformats.org/drawingml/2006/picture">
                 <pic:pic>
                   <pic:nvPicPr>
-                    <pic:cNvPr id="0" name="fig4_triple_integration_v2.png"/>
+                    <pic:cNvPr id="0" name="fig5_triple_integration_dumbbell.png"/>
                     <pic:cNvPicPr/>
                   </pic:nvPicPr>
                   <pic:blipFill>
@@ -4024,7 +4024,7 @@
                   <pic:spPr>
                     <a:xfrm>
                       <a:off x="0" y="0"/>
-                      <a:ext cx="5852160" cy="3587313"/>
+                      <a:ext cx="5852160" cy="3867705"/>
                     </a:xfrm>
                     <a:prstGeom prst="rect"/>
                   </pic:spPr>
@@ -4046,7 +4046,7 @@
           <w:color w:val="555555"/>
           <w:sz w:val="18"/>
         </w:rPr>
-        <w:t>Figure 5. Triple-omics fusion results. A and B: PAM50 Accuracy and Macro-F1; C and D: survival ROC AUC and C-index. Error bars represent 5-fold cross-validation SD. PAM50 intersection n=493; survival intersection n=731.</w:t>
+        <w:t>Figure 5. Triple-omics fusion vs best single-omics. Each fusion scheme (colored point with SD) is linked to the best single-omics baseline on intersection samples (gray point). A and B: PAM50 Accuracy and Macro-F1; C and D: survival ROC AUC and C-index. Error bars represent 5-fold cross-validation SD. PAM50 intersection n=493; survival intersection n=731.</w:t>
       </w:r>
     </w:p>
     <w:p>
@@ -4092,7 +4092,7 @@
           <w:b w:val="0"/>
           <w:sz w:val="22"/>
         </w:rPr>
-        <w:t>在复杂方法中，Transformer 在 PAM50 上表现较好（Accuracy 0.9270、Macro-F1 0.9288），但生存 C-index 为 0.6938；Multi-task、DeepSurv、低秩双线性和 GNN 未在当前小样本上显示出稳定提升。Figure 6 汇总了这些复杂方法的 PAM50 与生存结果。</w:t>
+        <w:t>在复杂方法中，Transformer 在 PAM50 上表现较好（Accuracy 0.9270、Macro-F1 0.9288），但生存 C-index 为 0.6938；Multi-task、DeepSurv、低秩双线性和 GNN 未在当前小样本上显示出稳定提升。Figure 6 对比了这些复杂方法与最优单组学基线的 PAM50 与生存结果。</w:t>
       </w:r>
     </w:p>
     <w:p>
@@ -4104,7 +4104,7 @@
       <w:r>
         <w:drawing>
           <wp:inline xmlns:a="http://schemas.openxmlformats.org/drawingml/2006/main" xmlns:pic="http://schemas.openxmlformats.org/drawingml/2006/picture">
-            <wp:extent cx="5852160" cy="3749040"/>
+            <wp:extent cx="5852160" cy="3893510"/>
             <wp:docPr id="6" name="Picture 6"/>
             <wp:cNvGraphicFramePr>
               <a:graphicFrameLocks noChangeAspect="1"/>
@@ -4113,7 +4113,7 @@
               <a:graphicData uri="http://schemas.openxmlformats.org/drawingml/2006/picture">
                 <pic:pic>
                   <pic:nvPicPr>
-                    <pic:cNvPr id="0" name="fig5_advanced_methods_v2.png"/>
+                    <pic:cNvPr id="0" name="fig6_advanced_methods_dumbbell.png"/>
                     <pic:cNvPicPr/>
                   </pic:nvPicPr>
                   <pic:blipFill>
@@ -4125,7 +4125,7 @@
                   <pic:spPr>
                     <a:xfrm>
                       <a:off x="0" y="0"/>
-                      <a:ext cx="5852160" cy="3749040"/>
+                      <a:ext cx="5852160" cy="3893510"/>
                     </a:xfrm>
                     <a:prstGeom prst="rect"/>
                   </pic:spPr>
@@ -4147,7 +4147,7 @@
           <w:color w:val="555555"/>
           <w:sz w:val="18"/>
         </w:rPr>
-        <w:t>Figure 6. Advanced integration methods. A and B: PAM50 Accuracy and Macro-F1; C and D: survival ROC AUC and C-index. Methods include Multi-task, DeepSurv, Transformer, low-rank bilinear fusion, and GNN. Error bars represent 5-fold cross-validation SD.</w:t>
+        <w:t>Figure 6. Advanced integration methods vs best single-omics. Colored points (mean±SD) are Multi-task, DeepSurv, Transformer, low-rank bilinear fusion, and GNN, each linked to the best single-omics baseline (gray point). A and B: PAM50 Accuracy and Macro-F1; C and D: survival ROC AUC and C-index. Error bars represent 5-fold cross-validation SD.</w:t>
       </w:r>
     </w:p>
     <w:p>
@@ -4410,7 +4410,7 @@
           <w:b w:val="0"/>
           <w:sz w:val="22"/>
         </w:rPr>
-        <w:t>对 mRNA、CNV 和 miRNA 分别遮盖 Development/Epithelium、Signaling/Transport、Hormone/Metabolism、Cell cycle/Proliferation 和 Other 等类别。mRNA PAM50 基线 Accuracy 为 0.9244±0.0124，Macro-F1 为 0.9069±0.0133；遮盖 Other 后 Macro-F1 降至 0.8819±0.0210。mRNA 生存基线 C-index 为 0.6984±0.0756，遮盖 Other 后降至 0.6757±0.0715。CNV 和 miRNA 同样显示 Other 类遮盖后性能下降最明显，但由于 Other 类特征数量较多，下降幅度同时受模块大小影响；CNV 与 miRNA 的遮盖结果见图 9，mRNA 结果见补充材料表 S16，CNV/miRNA 结果见补充材料表 S17。</w:t>
+        <w:t>对 mRNA、CNV 和 miRNA 分别遮盖 Development/Epithelium、Signaling/Transport、Hormone/Metabolism、Cell cycle/Proliferation 和 Other 等类别。mRNA PAM50 基线 Accuracy 为 0.9244±0.0124，Macro-F1 为 0.9069±0.0133；遮盖 Other 后 Macro-F1 降至 0.8819±0.0210。mRNA 生存基线 C-index 为 0.6984±0.0756，遮盖 Other 后降至 0.6757±0.0715。CNV 和 miRNA 同样显示 Other 类遮盖后性能下降最明显，但由于 Other 类特征数量较多，下降幅度同时受模块大小影响；CNV 与 miRNA 的遮盖 Δ 热力图见图 9，mRNA 结果见补充材料表 S16，CNV/miRNA 结果见补充材料表 S17。</w:t>
       </w:r>
     </w:p>
     <w:p>
@@ -4422,7 +4422,7 @@
       <w:r>
         <w:drawing>
           <wp:inline xmlns:a="http://schemas.openxmlformats.org/drawingml/2006/main" xmlns:pic="http://schemas.openxmlformats.org/drawingml/2006/picture">
-            <wp:extent cx="5852160" cy="3566160"/>
+            <wp:extent cx="5852160" cy="4633675"/>
             <wp:docPr id="9" name="Picture 9"/>
             <wp:cNvGraphicFramePr>
               <a:graphicFrameLocks noChangeAspect="1"/>
@@ -4431,7 +4431,7 @@
               <a:graphicData uri="http://schemas.openxmlformats.org/drawingml/2006/picture">
                 <pic:pic>
                   <pic:nvPicPr>
-                    <pic:cNvPr id="0" name="fig_other_omics_category_masking_v3.png"/>
+                    <pic:cNvPr id="0" name="fig9_category_masking_heatmap.png"/>
                     <pic:cNvPicPr/>
                   </pic:nvPicPr>
                   <pic:blipFill>
@@ -4443,7 +4443,7 @@
                   <pic:spPr>
                     <a:xfrm>
                       <a:off x="0" y="0"/>
-                      <a:ext cx="5852160" cy="3566160"/>
+                      <a:ext cx="5852160" cy="4633675"/>
                     </a:xfrm>
                     <a:prstGeom prst="rect"/>
                   </pic:spPr>
@@ -4465,7 +4465,7 @@
           <w:color w:val="555555"/>
           <w:sz w:val="18"/>
         </w:rPr>
-        <w:t>Figure 9. CNV and miRNA functional-category masking results. A-D: CNV PAM50, CNV Survival, miRNA PAM50, and miRNA Survival Accuracy or C-index. Error bars represent 5-fold cross-validation SD.</w:t>
+        <w:t>Figure 9. Functional-category masking heatmap. Each cell is the performance change (Δ) after masking a category relative to the unmasked baseline for CNV PAM50, CNV survival, miRNA PAM50, and miRNA survival (red, decrease; blue, increase). 5-fold cross-validation SD is reported in Supplementary Table S17.</w:t>
       </w:r>
     </w:p>
     <w:p>

</xml_diff>

<commit_message>
Revert Figure 4 to original bar chart
</commit_message>
<xml_diff>
--- a/docs/Supervised_distribution_divergence_guided_omics_imaging_manuscript_CN.docx
+++ b/docs/Supervised_distribution_divergence_guided_omics_imaging_manuscript_CN.docx
@@ -2945,7 +2945,7 @@
           <w:b w:val="0"/>
           <w:sz w:val="22"/>
         </w:rPr>
-        <w:t>Table 3 summarizes the overall best model for each task on full samples; Figure 4 shows all compared models as a heatmap. Full single-omics results are in Supplementary Table S4, and intersection single-omics baselines in Supplementary Table S5.</w:t>
+        <w:t>Table 3 summarizes the overall best model for each task on full samples; Figure 4 shows all compared models with mean±SD. Full single-omics results are in Supplementary Table S4, and intersection single-omics baselines in Supplementary Table S5.</w:t>
       </w:r>
     </w:p>
     <w:p>
@@ -3887,7 +3887,7 @@
       <w:r>
         <w:drawing>
           <wp:inline xmlns:a="http://schemas.openxmlformats.org/drawingml/2006/main" xmlns:pic="http://schemas.openxmlformats.org/drawingml/2006/picture">
-            <wp:extent cx="5852160" cy="4352029"/>
+            <wp:extent cx="5852160" cy="3365333"/>
             <wp:docPr id="4" name="Picture 4"/>
             <wp:cNvGraphicFramePr>
               <a:graphicFrameLocks noChangeAspect="1"/>
@@ -3896,7 +3896,7 @@
               <a:graphicData uri="http://schemas.openxmlformats.org/drawingml/2006/picture">
                 <pic:pic>
                   <pic:nvPicPr>
-                    <pic:cNvPr id="0" name="fig4_single_omics_heatmap.png"/>
+                    <pic:cNvPr id="0" name="fig3_single_omics_v3.png"/>
                     <pic:cNvPicPr/>
                   </pic:nvPicPr>
                   <pic:blipFill>
@@ -3908,7 +3908,7 @@
                   <pic:spPr>
                     <a:xfrm>
                       <a:off x="0" y="0"/>
-                      <a:ext cx="5852160" cy="4352029"/>
+                      <a:ext cx="5852160" cy="3365333"/>
                     </a:xfrm>
                     <a:prstGeom prst="rect"/>
                   </pic:spPr>
@@ -3930,7 +3930,7 @@
           <w:color w:val="555555"/>
           <w:sz w:val="18"/>
         </w:rPr>
-        <w:t>Figure 4. Single-omics prediction on full samples. Heatmaps show model performance for PAM50 Accuracy and Macro-F1 (A, B) and survival ROC AUC and C-index (C, D); rows are models and columns are omics (mRNA, CNV, miRNA). Values are 5-fold cross-validation means with features selected within each training fold. PAM50 sample sizes: mRNA 833, CNV 818, miRNA 497; survival: mRNA 1073, CNV 1057, miRNA 739.</w:t>
+        <w:t>Figure 4. Single-omics prediction on full samples. A and B: PAM50 Accuracy and Macro-F1; C and D: survival ROC AUC and C-index. Bars show 5-fold cross-validation mean±SD with features selected within each training fold. PAM50 sample sizes: mRNA 833, CNV 818, miRNA 497; survival: mRNA 1073, CNV 1057, miRNA 739.</w:t>
       </w:r>
     </w:p>
     <w:p>

</xml_diff>

<commit_message>
Shrink Figure 9 width
</commit_message>
<xml_diff>
--- a/docs/Supervised_distribution_divergence_guided_omics_imaging_manuscript_CN.docx
+++ b/docs/Supervised_distribution_divergence_guided_omics_imaging_manuscript_CN.docx
@@ -4422,7 +4422,7 @@
       <w:r>
         <w:drawing>
           <wp:inline xmlns:a="http://schemas.openxmlformats.org/drawingml/2006/main" xmlns:pic="http://schemas.openxmlformats.org/drawingml/2006/picture">
-            <wp:extent cx="5852160" cy="4633675"/>
+            <wp:extent cx="3657600" cy="2896047"/>
             <wp:docPr id="9" name="Picture 9"/>
             <wp:cNvGraphicFramePr>
               <a:graphicFrameLocks noChangeAspect="1"/>
@@ -4443,7 +4443,7 @@
                   <pic:spPr>
                     <a:xfrm>
                       <a:off x="0" y="0"/>
-                      <a:ext cx="5852160" cy="4633675"/>
+                      <a:ext cx="3657600" cy="2896047"/>
                     </a:xfrm>
                     <a:prstGeom prst="rect"/>
                   </pic:spPr>

</xml_diff>

<commit_message>
Use per-column normalized heatmaps for Figures 5 and 6
</commit_message>
<xml_diff>
--- a/docs/Supervised_distribution_divergence_guided_omics_imaging_manuscript_CN.docx
+++ b/docs/Supervised_distribution_divergence_guided_omics_imaging_manuscript_CN.docx
@@ -3961,7 +3961,7 @@
           <w:b w:val="0"/>
           <w:sz w:val="22"/>
         </w:rPr>
-        <w:t>Figure 5 compares each triple-omics fusion scheme with the best single-omics baseline; full fusion results are in Supplementary Table S6, and the best fusion versus the corresponding best single-omics comparison is summarized in Supplementary Table S10.</w:t>
+        <w:t>Figure 5 shows the triple-omics fusion performance as a heatmap; full fusion results are in Supplementary Table S6, and the best fusion versus the corresponding best single-omics comparison is summarized in Supplementary Table S10.</w:t>
       </w:r>
     </w:p>
     <w:p>
@@ -4003,7 +4003,7 @@
       <w:r>
         <w:drawing>
           <wp:inline xmlns:a="http://schemas.openxmlformats.org/drawingml/2006/main" xmlns:pic="http://schemas.openxmlformats.org/drawingml/2006/picture">
-            <wp:extent cx="5852160" cy="3867705"/>
+            <wp:extent cx="5120640" cy="4681728"/>
             <wp:docPr id="5" name="Picture 5"/>
             <wp:cNvGraphicFramePr>
               <a:graphicFrameLocks noChangeAspect="1"/>
@@ -4012,7 +4012,7 @@
               <a:graphicData uri="http://schemas.openxmlformats.org/drawingml/2006/picture">
                 <pic:pic>
                   <pic:nvPicPr>
-                    <pic:cNvPr id="0" name="fig5_triple_integration_dumbbell.png"/>
+                    <pic:cNvPr id="0" name="fig5_triple_integration_heatmap.png"/>
                     <pic:cNvPicPr/>
                   </pic:nvPicPr>
                   <pic:blipFill>
@@ -4024,7 +4024,7 @@
                   <pic:spPr>
                     <a:xfrm>
                       <a:off x="0" y="0"/>
-                      <a:ext cx="5852160" cy="3867705"/>
+                      <a:ext cx="5120640" cy="4681728"/>
                     </a:xfrm>
                     <a:prstGeom prst="rect"/>
                   </pic:spPr>
@@ -4046,7 +4046,7 @@
           <w:color w:val="555555"/>
           <w:sz w:val="18"/>
         </w:rPr>
-        <w:t>Figure 5. Triple-omics fusion vs best single-omics. Each fusion scheme (colored point with SD) is linked to the best single-omics baseline on intersection samples (gray point). A and B: PAM50 Accuracy and Macro-F1; C and D: survival ROC AUC and C-index. Error bars represent 5-fold cross-validation SD. PAM50 intersection n=493; survival intersection n=731.</w:t>
+        <w:t>Figure 5. Triple-omics fusion performance heatmap. Rows are fusion schemes and columns are PAM50 Accuracy, Macro-F1, survival ROC AUC, and C-index. Colors are per-column normalized; cell values are 5-fold cross-validation means. PAM50 intersection n=493; survival intersection n=731.</w:t>
       </w:r>
     </w:p>
     <w:p>
@@ -4092,7 +4092,7 @@
           <w:b w:val="0"/>
           <w:sz w:val="22"/>
         </w:rPr>
-        <w:t>在复杂方法中，Transformer 在 PAM50 上表现较好（Accuracy 0.9270、Macro-F1 0.9288），但生存 C-index 为 0.6938；Multi-task、DeepSurv、低秩双线性和 GNN 未在当前小样本上显示出稳定提升。Figure 6 对比了这些复杂方法与最优单组学基线的 PAM50 与生存结果。</w:t>
+        <w:t>在复杂方法中，Transformer 在 PAM50 上表现较好（Accuracy 0.9270、Macro-F1 0.9288），但生存 C-index 为 0.6938；Multi-task、DeepSurv、低秩双线性和 GNN 未在当前小样本上显示出稳定提升。Figure 6 以热力图汇总了这些复杂方法的 PAM50 与生存结果。</w:t>
       </w:r>
     </w:p>
     <w:p>
@@ -4104,7 +4104,7 @@
       <w:r>
         <w:drawing>
           <wp:inline xmlns:a="http://schemas.openxmlformats.org/drawingml/2006/main" xmlns:pic="http://schemas.openxmlformats.org/drawingml/2006/picture">
-            <wp:extent cx="5852160" cy="3893510"/>
+            <wp:extent cx="4754880" cy="3109827"/>
             <wp:docPr id="6" name="Picture 6"/>
             <wp:cNvGraphicFramePr>
               <a:graphicFrameLocks noChangeAspect="1"/>
@@ -4113,7 +4113,7 @@
               <a:graphicData uri="http://schemas.openxmlformats.org/drawingml/2006/picture">
                 <pic:pic>
                   <pic:nvPicPr>
-                    <pic:cNvPr id="0" name="fig6_advanced_methods_dumbbell.png"/>
+                    <pic:cNvPr id="0" name="fig6_advanced_methods_heatmap.png"/>
                     <pic:cNvPicPr/>
                   </pic:nvPicPr>
                   <pic:blipFill>
@@ -4125,7 +4125,7 @@
                   <pic:spPr>
                     <a:xfrm>
                       <a:off x="0" y="0"/>
-                      <a:ext cx="5852160" cy="3893510"/>
+                      <a:ext cx="4754880" cy="3109827"/>
                     </a:xfrm>
                     <a:prstGeom prst="rect"/>
                   </pic:spPr>
@@ -4147,7 +4147,7 @@
           <w:color w:val="555555"/>
           <w:sz w:val="18"/>
         </w:rPr>
-        <w:t>Figure 6. Advanced integration methods vs best single-omics. Colored points (mean±SD) are Multi-task, DeepSurv, Transformer, low-rank bilinear fusion, and GNN, each linked to the best single-omics baseline (gray point). A and B: PAM50 Accuracy and Macro-F1; C and D: survival ROC AUC and C-index. Error bars represent 5-fold cross-validation SD.</w:t>
+        <w:t>Figure 6. Advanced integration method performance heatmap. Rows are Multi-task, DeepSurv, Transformer, low-rank bilinear fusion, and GNN; columns are PAM50 Accuracy, Macro-F1, survival ROC AUC, and C-index. Colors are per-column normalized; cell values are 5-fold cross-validation means. DeepSurv has no PAM50 output (NA).</w:t>
       </w:r>
     </w:p>
     <w:p>

</xml_diff>

<commit_message>
Shrink Figures 5 and 6 heatmaps
</commit_message>
<xml_diff>
--- a/docs/Supervised_distribution_divergence_guided_omics_imaging_manuscript_CN.docx
+++ b/docs/Supervised_distribution_divergence_guided_omics_imaging_manuscript_CN.docx
@@ -4003,7 +4003,7 @@
       <w:r>
         <w:drawing>
           <wp:inline xmlns:a="http://schemas.openxmlformats.org/drawingml/2006/main" xmlns:pic="http://schemas.openxmlformats.org/drawingml/2006/picture">
-            <wp:extent cx="5120640" cy="4681728"/>
+            <wp:extent cx="4023360" cy="3678501"/>
             <wp:docPr id="5" name="Picture 5"/>
             <wp:cNvGraphicFramePr>
               <a:graphicFrameLocks noChangeAspect="1"/>
@@ -4024,7 +4024,7 @@
                   <pic:spPr>
                     <a:xfrm>
                       <a:off x="0" y="0"/>
-                      <a:ext cx="5120640" cy="4681728"/>
+                      <a:ext cx="4023360" cy="3678501"/>
                     </a:xfrm>
                     <a:prstGeom prst="rect"/>
                   </pic:spPr>
@@ -4104,7 +4104,7 @@
       <w:r>
         <w:drawing>
           <wp:inline xmlns:a="http://schemas.openxmlformats.org/drawingml/2006/main" xmlns:pic="http://schemas.openxmlformats.org/drawingml/2006/picture">
-            <wp:extent cx="4754880" cy="3109827"/>
+            <wp:extent cx="3657600" cy="2392174"/>
             <wp:docPr id="6" name="Picture 6"/>
             <wp:cNvGraphicFramePr>
               <a:graphicFrameLocks noChangeAspect="1"/>
@@ -4125,7 +4125,7 @@
                   <pic:spPr>
                     <a:xfrm>
                       <a:off x="0" y="0"/>
-                      <a:ext cx="4754880" cy="3109827"/>
+                      <a:ext cx="3657600" cy="2392174"/>
                     </a:xfrm>
                     <a:prstGeom prst="rect"/>
                   </pic:spPr>

</xml_diff>